<commit_message>
Running ans generating submission docx
</commit_message>
<xml_diff>
--- a/submission-report.docx
+++ b/submission-report.docx
@@ -19,7 +19,7 @@
         </w:numPr>
       </w:pPr>
       <w:r>
-        <w:t xml:space="preserve">Submission generated at 08/31/2026 at 09:41:12</w:t>
+        <w:t xml:space="preserve">Submission generated at 08/31/2026 at 09:59:20</w:t>
       </w:r>
     </w:p>
     <w:p>
@@ -426,6 +426,138 @@
         <w:rPr>
           <w:rStyle w:val="NormalTok"/>
         </w:rPr>
+        <w:t xml:space="preserve"> src/lab.c </w:t>
+      </w:r>
+      <w:r>
+        <w:rPr>
+          <w:rStyle w:val="AttributeTok"/>
+        </w:rPr>
+        <w:t xml:space="preserve">-o</w:t>
+      </w:r>
+      <w:r>
+        <w:rPr>
+          <w:rStyle w:val="NormalTok"/>
+        </w:rPr>
+        <w:t xml:space="preserve"> build/debug/lab.c.o</w:t>
+      </w:r>
+      <w:r>
+        <w:br/>
+      </w:r>
+      <w:r>
+        <w:rPr>
+          <w:rStyle w:val="FunctionTok"/>
+        </w:rPr>
+        <w:t xml:space="preserve">mkdir</w:t>
+      </w:r>
+      <w:r>
+        <w:rPr>
+          <w:rStyle w:val="NormalTok"/>
+        </w:rPr>
+        <w:t xml:space="preserve"> </w:t>
+      </w:r>
+      <w:r>
+        <w:rPr>
+          <w:rStyle w:val="AttributeTok"/>
+        </w:rPr>
+        <w:t xml:space="preserve">-p</w:t>
+      </w:r>
+      <w:r>
+        <w:rPr>
+          <w:rStyle w:val="NormalTok"/>
+        </w:rPr>
+        <w:t xml:space="preserve"> build/debug</w:t>
+      </w:r>
+      <w:r>
+        <w:br/>
+      </w:r>
+      <w:r>
+        <w:rPr>
+          <w:rStyle w:val="FunctionTok"/>
+        </w:rPr>
+        <w:t xml:space="preserve">cc</w:t>
+      </w:r>
+      <w:r>
+        <w:rPr>
+          <w:rStyle w:val="NormalTok"/>
+        </w:rPr>
+        <w:t xml:space="preserve"> </w:t>
+      </w:r>
+      <w:r>
+        <w:rPr>
+          <w:rStyle w:val="AttributeTok"/>
+        </w:rPr>
+        <w:t xml:space="preserve">-g</w:t>
+      </w:r>
+      <w:r>
+        <w:rPr>
+          <w:rStyle w:val="NormalTok"/>
+        </w:rPr>
+        <w:t xml:space="preserve"> </w:t>
+      </w:r>
+      <w:r>
+        <w:rPr>
+          <w:rStyle w:val="AttributeTok"/>
+        </w:rPr>
+        <w:t xml:space="preserve">-O0</w:t>
+      </w:r>
+      <w:r>
+        <w:rPr>
+          <w:rStyle w:val="NormalTok"/>
+        </w:rPr>
+        <w:t xml:space="preserve"> </w:t>
+      </w:r>
+      <w:r>
+        <w:rPr>
+          <w:rStyle w:val="AttributeTok"/>
+        </w:rPr>
+        <w:t xml:space="preserve">-DDEBUG</w:t>
+      </w:r>
+      <w:r>
+        <w:rPr>
+          <w:rStyle w:val="NormalTok"/>
+        </w:rPr>
+        <w:t xml:space="preserve"> </w:t>
+      </w:r>
+      <w:r>
+        <w:rPr>
+          <w:rStyle w:val="AttributeTok"/>
+        </w:rPr>
+        <w:t xml:space="preserve">-fno-omit-frame-pointer</w:t>
+      </w:r>
+      <w:r>
+        <w:rPr>
+          <w:rStyle w:val="NormalTok"/>
+        </w:rPr>
+        <w:t xml:space="preserve"> </w:t>
+      </w:r>
+      <w:r>
+        <w:rPr>
+          <w:rStyle w:val="AttributeTok"/>
+        </w:rPr>
+        <w:t xml:space="preserve">-fsanitize</w:t>
+      </w:r>
+      <w:r>
+        <w:rPr>
+          <w:rStyle w:val="OperatorTok"/>
+        </w:rPr>
+        <w:t xml:space="preserve">=</w:t>
+      </w:r>
+      <w:r>
+        <w:rPr>
+          <w:rStyle w:val="NormalTok"/>
+        </w:rPr>
+        <w:t xml:space="preserve">address </w:t>
+      </w:r>
+      <w:r>
+        <w:rPr>
+          <w:rStyle w:val="AttributeTok"/>
+        </w:rPr>
+        <w:t xml:space="preserve">-c</w:t>
+      </w:r>
+      <w:r>
+        <w:rPr>
+          <w:rStyle w:val="NormalTok"/>
+        </w:rPr>
         <w:t xml:space="preserve"> src/main.c </w:t>
       </w:r>
       <w:r>
@@ -447,6 +579,207 @@
         <w:rPr>
           <w:rStyle w:val="FunctionTok"/>
         </w:rPr>
+        <w:t xml:space="preserve">cc</w:t>
+      </w:r>
+      <w:r>
+        <w:rPr>
+          <w:rStyle w:val="NormalTok"/>
+        </w:rPr>
+        <w:t xml:space="preserve"> </w:t>
+      </w:r>
+      <w:r>
+        <w:rPr>
+          <w:rStyle w:val="AttributeTok"/>
+        </w:rPr>
+        <w:t xml:space="preserve">-g</w:t>
+      </w:r>
+      <w:r>
+        <w:rPr>
+          <w:rStyle w:val="NormalTok"/>
+        </w:rPr>
+        <w:t xml:space="preserve"> </w:t>
+      </w:r>
+      <w:r>
+        <w:rPr>
+          <w:rStyle w:val="AttributeTok"/>
+        </w:rPr>
+        <w:t xml:space="preserve">-O0</w:t>
+      </w:r>
+      <w:r>
+        <w:rPr>
+          <w:rStyle w:val="NormalTok"/>
+        </w:rPr>
+        <w:t xml:space="preserve"> </w:t>
+      </w:r>
+      <w:r>
+        <w:rPr>
+          <w:rStyle w:val="AttributeTok"/>
+        </w:rPr>
+        <w:t xml:space="preserve">-DDEBUG</w:t>
+      </w:r>
+      <w:r>
+        <w:rPr>
+          <w:rStyle w:val="NormalTok"/>
+        </w:rPr>
+        <w:t xml:space="preserve"> </w:t>
+      </w:r>
+      <w:r>
+        <w:rPr>
+          <w:rStyle w:val="AttributeTok"/>
+        </w:rPr>
+        <w:t xml:space="preserve">-fno-omit-frame-pointer</w:t>
+      </w:r>
+      <w:r>
+        <w:rPr>
+          <w:rStyle w:val="NormalTok"/>
+        </w:rPr>
+        <w:t xml:space="preserve"> </w:t>
+      </w:r>
+      <w:r>
+        <w:rPr>
+          <w:rStyle w:val="AttributeTok"/>
+        </w:rPr>
+        <w:t xml:space="preserve">-fsanitize</w:t>
+      </w:r>
+      <w:r>
+        <w:rPr>
+          <w:rStyle w:val="OperatorTok"/>
+        </w:rPr>
+        <w:t xml:space="preserve">=</w:t>
+      </w:r>
+      <w:r>
+        <w:rPr>
+          <w:rStyle w:val="NormalTok"/>
+        </w:rPr>
+        <w:t xml:space="preserve">address build/debug/lab.c.o build/debug/main.c.o </w:t>
+      </w:r>
+      <w:r>
+        <w:rPr>
+          <w:rStyle w:val="AttributeTok"/>
+        </w:rPr>
+        <w:t xml:space="preserve">-o</w:t>
+      </w:r>
+      <w:r>
+        <w:rPr>
+          <w:rStyle w:val="NormalTok"/>
+        </w:rPr>
+        <w:t xml:space="preserve"> build/debug/myapp_d </w:t>
+      </w:r>
+      <w:r>
+        <w:rPr>
+          <w:rStyle w:val="AttributeTok"/>
+        </w:rPr>
+        <w:t xml:space="preserve">-fsanitize</w:t>
+      </w:r>
+      <w:r>
+        <w:rPr>
+          <w:rStyle w:val="OperatorTok"/>
+        </w:rPr>
+        <w:t xml:space="preserve">=</w:t>
+      </w:r>
+      <w:r>
+        <w:rPr>
+          <w:rStyle w:val="NormalTok"/>
+        </w:rPr>
+        <w:t xml:space="preserve">address</w:t>
+      </w:r>
+      <w:r>
+        <w:br/>
+      </w:r>
+      <w:r>
+        <w:rPr>
+          <w:rStyle w:val="VariableTok"/>
+        </w:rPr>
+        <w:t xml:space="preserve">make</w:t>
+      </w:r>
+      <w:r>
+        <w:rPr>
+          <w:rStyle w:val="OperatorTok"/>
+        </w:rPr>
+        <w:t xml:space="preserve">[</w:t>
+      </w:r>
+      <w:r>
+        <w:rPr>
+          <w:rStyle w:val="DecValTok"/>
+        </w:rPr>
+        <w:t xml:space="preserve">1</w:t>
+      </w:r>
+      <w:r>
+        <w:rPr>
+          <w:rStyle w:val="OperatorTok"/>
+        </w:rPr>
+        <w:t xml:space="preserve">]</w:t>
+      </w:r>
+      <w:r>
+        <w:rPr>
+          <w:rStyle w:val="ExtensionTok"/>
+        </w:rPr>
+        <w:t xml:space="preserve">:</w:t>
+      </w:r>
+      <w:r>
+        <w:rPr>
+          <w:rStyle w:val="NormalTok"/>
+        </w:rPr>
+        <w:t xml:space="preserve"> Leaving directory </w:t>
+      </w:r>
+      <w:r>
+        <w:rPr>
+          <w:rStyle w:val="StringTok"/>
+        </w:rPr>
+        <w:t xml:space="preserve">'/home/PERRYARYEE/Computer-Networks-CS525'</w:t>
+      </w:r>
+      <w:r>
+        <w:br/>
+      </w:r>
+      <w:r>
+        <w:rPr>
+          <w:rStyle w:val="VariableTok"/>
+        </w:rPr>
+        <w:t xml:space="preserve">make</w:t>
+      </w:r>
+      <w:r>
+        <w:rPr>
+          <w:rStyle w:val="OperatorTok"/>
+        </w:rPr>
+        <w:t xml:space="preserve">[</w:t>
+      </w:r>
+      <w:r>
+        <w:rPr>
+          <w:rStyle w:val="DecValTok"/>
+        </w:rPr>
+        <w:t xml:space="preserve">1</w:t>
+      </w:r>
+      <w:r>
+        <w:rPr>
+          <w:rStyle w:val="OperatorTok"/>
+        </w:rPr>
+        <w:t xml:space="preserve">]</w:t>
+      </w:r>
+      <w:r>
+        <w:rPr>
+          <w:rStyle w:val="ExtensionTok"/>
+        </w:rPr>
+        <w:t xml:space="preserve">:</w:t>
+      </w:r>
+      <w:r>
+        <w:rPr>
+          <w:rStyle w:val="NormalTok"/>
+        </w:rPr>
+        <w:t xml:space="preserve"> Entering directory </w:t>
+      </w:r>
+      <w:r>
+        <w:rPr>
+          <w:rStyle w:val="StringTok"/>
+        </w:rPr>
+        <w:t xml:space="preserve">'/home/PERRYARYEE/Computer-Networks-CS525'</w:t>
+      </w:r>
+      <w:r>
+        <w:br/>
+      </w:r>
+      <w:r>
+        <w:rPr>
+          <w:rStyle w:val="FunctionTok"/>
+        </w:rPr>
         <w:t xml:space="preserve">mkdir</w:t>
       </w:r>
       <w:r>
@@ -465,7 +798,7 @@
         <w:rPr>
           <w:rStyle w:val="NormalTok"/>
         </w:rPr>
-        <w:t xml:space="preserve"> build/debug</w:t>
+        <w:t xml:space="preserve"> build/release</w:t>
       </w:r>
       <w:r>
         <w:br/>
@@ -486,6 +819,921 @@
         <w:rPr>
           <w:rStyle w:val="AttributeTok"/>
         </w:rPr>
+        <w:t xml:space="preserve">-Wall</w:t>
+      </w:r>
+      <w:r>
+        <w:rPr>
+          <w:rStyle w:val="NormalTok"/>
+        </w:rPr>
+        <w:t xml:space="preserve"> </w:t>
+      </w:r>
+      <w:r>
+        <w:rPr>
+          <w:rStyle w:val="AttributeTok"/>
+        </w:rPr>
+        <w:t xml:space="preserve">-Wextra</w:t>
+      </w:r>
+      <w:r>
+        <w:rPr>
+          <w:rStyle w:val="NormalTok"/>
+        </w:rPr>
+        <w:t xml:space="preserve"> </w:t>
+      </w:r>
+      <w:r>
+        <w:rPr>
+          <w:rStyle w:val="AttributeTok"/>
+        </w:rPr>
+        <w:t xml:space="preserve">-O2</w:t>
+      </w:r>
+      <w:r>
+        <w:rPr>
+          <w:rStyle w:val="NormalTok"/>
+        </w:rPr>
+        <w:t xml:space="preserve"> </w:t>
+      </w:r>
+      <w:r>
+        <w:rPr>
+          <w:rStyle w:val="AttributeTok"/>
+        </w:rPr>
+        <w:t xml:space="preserve">-fPIE</w:t>
+      </w:r>
+      <w:r>
+        <w:rPr>
+          <w:rStyle w:val="NormalTok"/>
+        </w:rPr>
+        <w:t xml:space="preserve"> </w:t>
+      </w:r>
+      <w:r>
+        <w:rPr>
+          <w:rStyle w:val="AttributeTok"/>
+        </w:rPr>
+        <w:t xml:space="preserve">-MMD</w:t>
+      </w:r>
+      <w:r>
+        <w:rPr>
+          <w:rStyle w:val="NormalTok"/>
+        </w:rPr>
+        <w:t xml:space="preserve"> </w:t>
+      </w:r>
+      <w:r>
+        <w:rPr>
+          <w:rStyle w:val="AttributeTok"/>
+        </w:rPr>
+        <w:t xml:space="preserve">-MP</w:t>
+      </w:r>
+      <w:r>
+        <w:rPr>
+          <w:rStyle w:val="NormalTok"/>
+        </w:rPr>
+        <w:t xml:space="preserve"> </w:t>
+      </w:r>
+      <w:r>
+        <w:rPr>
+          <w:rStyle w:val="AttributeTok"/>
+        </w:rPr>
+        <w:t xml:space="preserve">-Wformat</w:t>
+      </w:r>
+      <w:r>
+        <w:rPr>
+          <w:rStyle w:val="NormalTok"/>
+        </w:rPr>
+        <w:t xml:space="preserve"> </w:t>
+      </w:r>
+      <w:r>
+        <w:rPr>
+          <w:rStyle w:val="AttributeTok"/>
+        </w:rPr>
+        <w:t xml:space="preserve">-Wformat</w:t>
+      </w:r>
+      <w:r>
+        <w:rPr>
+          <w:rStyle w:val="OperatorTok"/>
+        </w:rPr>
+        <w:t xml:space="preserve">=</w:t>
+      </w:r>
+      <w:r>
+        <w:rPr>
+          <w:rStyle w:val="NormalTok"/>
+        </w:rPr>
+        <w:t xml:space="preserve">2 </w:t>
+      </w:r>
+      <w:r>
+        <w:rPr>
+          <w:rStyle w:val="AttributeTok"/>
+        </w:rPr>
+        <w:t xml:space="preserve">-Wconversion</w:t>
+      </w:r>
+      <w:r>
+        <w:rPr>
+          <w:rStyle w:val="NormalTok"/>
+        </w:rPr>
+        <w:t xml:space="preserve"> </w:t>
+      </w:r>
+      <w:r>
+        <w:rPr>
+          <w:rStyle w:val="AttributeTok"/>
+        </w:rPr>
+        <w:t xml:space="preserve">-Wsign-conversion</w:t>
+      </w:r>
+      <w:r>
+        <w:rPr>
+          <w:rStyle w:val="NormalTok"/>
+        </w:rPr>
+        <w:t xml:space="preserve"> </w:t>
+      </w:r>
+      <w:r>
+        <w:rPr>
+          <w:rStyle w:val="AttributeTok"/>
+        </w:rPr>
+        <w:t xml:space="preserve">-Wimplicit-fallthrough</w:t>
+      </w:r>
+      <w:r>
+        <w:rPr>
+          <w:rStyle w:val="NormalTok"/>
+        </w:rPr>
+        <w:t xml:space="preserve"> </w:t>
+      </w:r>
+      <w:r>
+        <w:rPr>
+          <w:rStyle w:val="AttributeTok"/>
+        </w:rPr>
+        <w:t xml:space="preserve">-fstack-protector-strong</w:t>
+      </w:r>
+      <w:r>
+        <w:rPr>
+          <w:rStyle w:val="NormalTok"/>
+        </w:rPr>
+        <w:t xml:space="preserve"> </w:t>
+      </w:r>
+      <w:r>
+        <w:rPr>
+          <w:rStyle w:val="AttributeTok"/>
+        </w:rPr>
+        <w:t xml:space="preserve">-Werror</w:t>
+      </w:r>
+      <w:r>
+        <w:rPr>
+          <w:rStyle w:val="OperatorTok"/>
+        </w:rPr>
+        <w:t xml:space="preserve">=</w:t>
+      </w:r>
+      <w:r>
+        <w:rPr>
+          <w:rStyle w:val="NormalTok"/>
+        </w:rPr>
+        <w:t xml:space="preserve">format-security </w:t>
+      </w:r>
+      <w:r>
+        <w:rPr>
+          <w:rStyle w:val="AttributeTok"/>
+        </w:rPr>
+        <w:t xml:space="preserve">-Werror</w:t>
+      </w:r>
+      <w:r>
+        <w:rPr>
+          <w:rStyle w:val="OperatorTok"/>
+        </w:rPr>
+        <w:t xml:space="preserve">=</w:t>
+      </w:r>
+      <w:r>
+        <w:rPr>
+          <w:rStyle w:val="NormalTok"/>
+        </w:rPr>
+        <w:t xml:space="preserve">implicit </w:t>
+      </w:r>
+      <w:r>
+        <w:rPr>
+          <w:rStyle w:val="AttributeTok"/>
+        </w:rPr>
+        <w:t xml:space="preserve">-Werror</w:t>
+      </w:r>
+      <w:r>
+        <w:rPr>
+          <w:rStyle w:val="OperatorTok"/>
+        </w:rPr>
+        <w:t xml:space="preserve">=</w:t>
+      </w:r>
+      <w:r>
+        <w:rPr>
+          <w:rStyle w:val="NormalTok"/>
+        </w:rPr>
+        <w:t xml:space="preserve">incompatible-pointer-types </w:t>
+      </w:r>
+      <w:r>
+        <w:rPr>
+          <w:rStyle w:val="AttributeTok"/>
+        </w:rPr>
+        <w:t xml:space="preserve">-Werror</w:t>
+      </w:r>
+      <w:r>
+        <w:rPr>
+          <w:rStyle w:val="OperatorTok"/>
+        </w:rPr>
+        <w:t xml:space="preserve">=</w:t>
+      </w:r>
+      <w:r>
+        <w:rPr>
+          <w:rStyle w:val="NormalTok"/>
+        </w:rPr>
+        <w:t xml:space="preserve">int-conversion </w:t>
+      </w:r>
+      <w:r>
+        <w:rPr>
+          <w:rStyle w:val="AttributeTok"/>
+        </w:rPr>
+        <w:t xml:space="preserve">-c</w:t>
+      </w:r>
+      <w:r>
+        <w:rPr>
+          <w:rStyle w:val="NormalTok"/>
+        </w:rPr>
+        <w:t xml:space="preserve"> src/lab.c </w:t>
+      </w:r>
+      <w:r>
+        <w:rPr>
+          <w:rStyle w:val="AttributeTok"/>
+        </w:rPr>
+        <w:t xml:space="preserve">-o</w:t>
+      </w:r>
+      <w:r>
+        <w:rPr>
+          <w:rStyle w:val="NormalTok"/>
+        </w:rPr>
+        <w:t xml:space="preserve"> build/release/lab.c.o</w:t>
+      </w:r>
+      <w:r>
+        <w:br/>
+      </w:r>
+      <w:r>
+        <w:rPr>
+          <w:rStyle w:val="FunctionTok"/>
+        </w:rPr>
+        <w:t xml:space="preserve">mkdir</w:t>
+      </w:r>
+      <w:r>
+        <w:rPr>
+          <w:rStyle w:val="NormalTok"/>
+        </w:rPr>
+        <w:t xml:space="preserve"> </w:t>
+      </w:r>
+      <w:r>
+        <w:rPr>
+          <w:rStyle w:val="AttributeTok"/>
+        </w:rPr>
+        <w:t xml:space="preserve">-p</w:t>
+      </w:r>
+      <w:r>
+        <w:rPr>
+          <w:rStyle w:val="NormalTok"/>
+        </w:rPr>
+        <w:t xml:space="preserve"> build/release</w:t>
+      </w:r>
+      <w:r>
+        <w:br/>
+      </w:r>
+      <w:r>
+        <w:rPr>
+          <w:rStyle w:val="FunctionTok"/>
+        </w:rPr>
+        <w:t xml:space="preserve">cc</w:t>
+      </w:r>
+      <w:r>
+        <w:rPr>
+          <w:rStyle w:val="NormalTok"/>
+        </w:rPr>
+        <w:t xml:space="preserve"> </w:t>
+      </w:r>
+      <w:r>
+        <w:rPr>
+          <w:rStyle w:val="AttributeTok"/>
+        </w:rPr>
+        <w:t xml:space="preserve">-Wall</w:t>
+      </w:r>
+      <w:r>
+        <w:rPr>
+          <w:rStyle w:val="NormalTok"/>
+        </w:rPr>
+        <w:t xml:space="preserve"> </w:t>
+      </w:r>
+      <w:r>
+        <w:rPr>
+          <w:rStyle w:val="AttributeTok"/>
+        </w:rPr>
+        <w:t xml:space="preserve">-Wextra</w:t>
+      </w:r>
+      <w:r>
+        <w:rPr>
+          <w:rStyle w:val="NormalTok"/>
+        </w:rPr>
+        <w:t xml:space="preserve"> </w:t>
+      </w:r>
+      <w:r>
+        <w:rPr>
+          <w:rStyle w:val="AttributeTok"/>
+        </w:rPr>
+        <w:t xml:space="preserve">-O2</w:t>
+      </w:r>
+      <w:r>
+        <w:rPr>
+          <w:rStyle w:val="NormalTok"/>
+        </w:rPr>
+        <w:t xml:space="preserve"> </w:t>
+      </w:r>
+      <w:r>
+        <w:rPr>
+          <w:rStyle w:val="AttributeTok"/>
+        </w:rPr>
+        <w:t xml:space="preserve">-fPIE</w:t>
+      </w:r>
+      <w:r>
+        <w:rPr>
+          <w:rStyle w:val="NormalTok"/>
+        </w:rPr>
+        <w:t xml:space="preserve"> </w:t>
+      </w:r>
+      <w:r>
+        <w:rPr>
+          <w:rStyle w:val="AttributeTok"/>
+        </w:rPr>
+        <w:t xml:space="preserve">-MMD</w:t>
+      </w:r>
+      <w:r>
+        <w:rPr>
+          <w:rStyle w:val="NormalTok"/>
+        </w:rPr>
+        <w:t xml:space="preserve"> </w:t>
+      </w:r>
+      <w:r>
+        <w:rPr>
+          <w:rStyle w:val="AttributeTok"/>
+        </w:rPr>
+        <w:t xml:space="preserve">-MP</w:t>
+      </w:r>
+      <w:r>
+        <w:rPr>
+          <w:rStyle w:val="NormalTok"/>
+        </w:rPr>
+        <w:t xml:space="preserve"> </w:t>
+      </w:r>
+      <w:r>
+        <w:rPr>
+          <w:rStyle w:val="AttributeTok"/>
+        </w:rPr>
+        <w:t xml:space="preserve">-Wformat</w:t>
+      </w:r>
+      <w:r>
+        <w:rPr>
+          <w:rStyle w:val="NormalTok"/>
+        </w:rPr>
+        <w:t xml:space="preserve"> </w:t>
+      </w:r>
+      <w:r>
+        <w:rPr>
+          <w:rStyle w:val="AttributeTok"/>
+        </w:rPr>
+        <w:t xml:space="preserve">-Wformat</w:t>
+      </w:r>
+      <w:r>
+        <w:rPr>
+          <w:rStyle w:val="OperatorTok"/>
+        </w:rPr>
+        <w:t xml:space="preserve">=</w:t>
+      </w:r>
+      <w:r>
+        <w:rPr>
+          <w:rStyle w:val="NormalTok"/>
+        </w:rPr>
+        <w:t xml:space="preserve">2 </w:t>
+      </w:r>
+      <w:r>
+        <w:rPr>
+          <w:rStyle w:val="AttributeTok"/>
+        </w:rPr>
+        <w:t xml:space="preserve">-Wconversion</w:t>
+      </w:r>
+      <w:r>
+        <w:rPr>
+          <w:rStyle w:val="NormalTok"/>
+        </w:rPr>
+        <w:t xml:space="preserve"> </w:t>
+      </w:r>
+      <w:r>
+        <w:rPr>
+          <w:rStyle w:val="AttributeTok"/>
+        </w:rPr>
+        <w:t xml:space="preserve">-Wsign-conversion</w:t>
+      </w:r>
+      <w:r>
+        <w:rPr>
+          <w:rStyle w:val="NormalTok"/>
+        </w:rPr>
+        <w:t xml:space="preserve"> </w:t>
+      </w:r>
+      <w:r>
+        <w:rPr>
+          <w:rStyle w:val="AttributeTok"/>
+        </w:rPr>
+        <w:t xml:space="preserve">-Wimplicit-fallthrough</w:t>
+      </w:r>
+      <w:r>
+        <w:rPr>
+          <w:rStyle w:val="NormalTok"/>
+        </w:rPr>
+        <w:t xml:space="preserve"> </w:t>
+      </w:r>
+      <w:r>
+        <w:rPr>
+          <w:rStyle w:val="AttributeTok"/>
+        </w:rPr>
+        <w:t xml:space="preserve">-fstack-protector-strong</w:t>
+      </w:r>
+      <w:r>
+        <w:rPr>
+          <w:rStyle w:val="NormalTok"/>
+        </w:rPr>
+        <w:t xml:space="preserve"> </w:t>
+      </w:r>
+      <w:r>
+        <w:rPr>
+          <w:rStyle w:val="AttributeTok"/>
+        </w:rPr>
+        <w:t xml:space="preserve">-Werror</w:t>
+      </w:r>
+      <w:r>
+        <w:rPr>
+          <w:rStyle w:val="OperatorTok"/>
+        </w:rPr>
+        <w:t xml:space="preserve">=</w:t>
+      </w:r>
+      <w:r>
+        <w:rPr>
+          <w:rStyle w:val="NormalTok"/>
+        </w:rPr>
+        <w:t xml:space="preserve">format-security </w:t>
+      </w:r>
+      <w:r>
+        <w:rPr>
+          <w:rStyle w:val="AttributeTok"/>
+        </w:rPr>
+        <w:t xml:space="preserve">-Werror</w:t>
+      </w:r>
+      <w:r>
+        <w:rPr>
+          <w:rStyle w:val="OperatorTok"/>
+        </w:rPr>
+        <w:t xml:space="preserve">=</w:t>
+      </w:r>
+      <w:r>
+        <w:rPr>
+          <w:rStyle w:val="NormalTok"/>
+        </w:rPr>
+        <w:t xml:space="preserve">implicit </w:t>
+      </w:r>
+      <w:r>
+        <w:rPr>
+          <w:rStyle w:val="AttributeTok"/>
+        </w:rPr>
+        <w:t xml:space="preserve">-Werror</w:t>
+      </w:r>
+      <w:r>
+        <w:rPr>
+          <w:rStyle w:val="OperatorTok"/>
+        </w:rPr>
+        <w:t xml:space="preserve">=</w:t>
+      </w:r>
+      <w:r>
+        <w:rPr>
+          <w:rStyle w:val="NormalTok"/>
+        </w:rPr>
+        <w:t xml:space="preserve">incompatible-pointer-types </w:t>
+      </w:r>
+      <w:r>
+        <w:rPr>
+          <w:rStyle w:val="AttributeTok"/>
+        </w:rPr>
+        <w:t xml:space="preserve">-Werror</w:t>
+      </w:r>
+      <w:r>
+        <w:rPr>
+          <w:rStyle w:val="OperatorTok"/>
+        </w:rPr>
+        <w:t xml:space="preserve">=</w:t>
+      </w:r>
+      <w:r>
+        <w:rPr>
+          <w:rStyle w:val="NormalTok"/>
+        </w:rPr>
+        <w:t xml:space="preserve">int-conversion </w:t>
+      </w:r>
+      <w:r>
+        <w:rPr>
+          <w:rStyle w:val="AttributeTok"/>
+        </w:rPr>
+        <w:t xml:space="preserve">-c</w:t>
+      </w:r>
+      <w:r>
+        <w:rPr>
+          <w:rStyle w:val="NormalTok"/>
+        </w:rPr>
+        <w:t xml:space="preserve"> src/main.c </w:t>
+      </w:r>
+      <w:r>
+        <w:rPr>
+          <w:rStyle w:val="AttributeTok"/>
+        </w:rPr>
+        <w:t xml:space="preserve">-o</w:t>
+      </w:r>
+      <w:r>
+        <w:rPr>
+          <w:rStyle w:val="NormalTok"/>
+        </w:rPr>
+        <w:t xml:space="preserve"> build/release/main.c.o</w:t>
+      </w:r>
+      <w:r>
+        <w:br/>
+      </w:r>
+      <w:r>
+        <w:rPr>
+          <w:rStyle w:val="FunctionTok"/>
+        </w:rPr>
+        <w:t xml:space="preserve">cc</w:t>
+      </w:r>
+      <w:r>
+        <w:rPr>
+          <w:rStyle w:val="NormalTok"/>
+        </w:rPr>
+        <w:t xml:space="preserve"> </w:t>
+      </w:r>
+      <w:r>
+        <w:rPr>
+          <w:rStyle w:val="AttributeTok"/>
+        </w:rPr>
+        <w:t xml:space="preserve">-Wall</w:t>
+      </w:r>
+      <w:r>
+        <w:rPr>
+          <w:rStyle w:val="NormalTok"/>
+        </w:rPr>
+        <w:t xml:space="preserve"> </w:t>
+      </w:r>
+      <w:r>
+        <w:rPr>
+          <w:rStyle w:val="AttributeTok"/>
+        </w:rPr>
+        <w:t xml:space="preserve">-Wextra</w:t>
+      </w:r>
+      <w:r>
+        <w:rPr>
+          <w:rStyle w:val="NormalTok"/>
+        </w:rPr>
+        <w:t xml:space="preserve"> </w:t>
+      </w:r>
+      <w:r>
+        <w:rPr>
+          <w:rStyle w:val="AttributeTok"/>
+        </w:rPr>
+        <w:t xml:space="preserve">-O2</w:t>
+      </w:r>
+      <w:r>
+        <w:rPr>
+          <w:rStyle w:val="NormalTok"/>
+        </w:rPr>
+        <w:t xml:space="preserve"> </w:t>
+      </w:r>
+      <w:r>
+        <w:rPr>
+          <w:rStyle w:val="AttributeTok"/>
+        </w:rPr>
+        <w:t xml:space="preserve">-fPIE</w:t>
+      </w:r>
+      <w:r>
+        <w:rPr>
+          <w:rStyle w:val="NormalTok"/>
+        </w:rPr>
+        <w:t xml:space="preserve"> </w:t>
+      </w:r>
+      <w:r>
+        <w:rPr>
+          <w:rStyle w:val="AttributeTok"/>
+        </w:rPr>
+        <w:t xml:space="preserve">-MMD</w:t>
+      </w:r>
+      <w:r>
+        <w:rPr>
+          <w:rStyle w:val="NormalTok"/>
+        </w:rPr>
+        <w:t xml:space="preserve"> </w:t>
+      </w:r>
+      <w:r>
+        <w:rPr>
+          <w:rStyle w:val="AttributeTok"/>
+        </w:rPr>
+        <w:t xml:space="preserve">-MP</w:t>
+      </w:r>
+      <w:r>
+        <w:rPr>
+          <w:rStyle w:val="NormalTok"/>
+        </w:rPr>
+        <w:t xml:space="preserve"> </w:t>
+      </w:r>
+      <w:r>
+        <w:rPr>
+          <w:rStyle w:val="AttributeTok"/>
+        </w:rPr>
+        <w:t xml:space="preserve">-Wformat</w:t>
+      </w:r>
+      <w:r>
+        <w:rPr>
+          <w:rStyle w:val="NormalTok"/>
+        </w:rPr>
+        <w:t xml:space="preserve"> </w:t>
+      </w:r>
+      <w:r>
+        <w:rPr>
+          <w:rStyle w:val="AttributeTok"/>
+        </w:rPr>
+        <w:t xml:space="preserve">-Wformat</w:t>
+      </w:r>
+      <w:r>
+        <w:rPr>
+          <w:rStyle w:val="OperatorTok"/>
+        </w:rPr>
+        <w:t xml:space="preserve">=</w:t>
+      </w:r>
+      <w:r>
+        <w:rPr>
+          <w:rStyle w:val="NormalTok"/>
+        </w:rPr>
+        <w:t xml:space="preserve">2 </w:t>
+      </w:r>
+      <w:r>
+        <w:rPr>
+          <w:rStyle w:val="AttributeTok"/>
+        </w:rPr>
+        <w:t xml:space="preserve">-Wconversion</w:t>
+      </w:r>
+      <w:r>
+        <w:rPr>
+          <w:rStyle w:val="NormalTok"/>
+        </w:rPr>
+        <w:t xml:space="preserve"> </w:t>
+      </w:r>
+      <w:r>
+        <w:rPr>
+          <w:rStyle w:val="AttributeTok"/>
+        </w:rPr>
+        <w:t xml:space="preserve">-Wsign-conversion</w:t>
+      </w:r>
+      <w:r>
+        <w:rPr>
+          <w:rStyle w:val="NormalTok"/>
+        </w:rPr>
+        <w:t xml:space="preserve"> </w:t>
+      </w:r>
+      <w:r>
+        <w:rPr>
+          <w:rStyle w:val="AttributeTok"/>
+        </w:rPr>
+        <w:t xml:space="preserve">-Wimplicit-fallthrough</w:t>
+      </w:r>
+      <w:r>
+        <w:rPr>
+          <w:rStyle w:val="NormalTok"/>
+        </w:rPr>
+        <w:t xml:space="preserve"> </w:t>
+      </w:r>
+      <w:r>
+        <w:rPr>
+          <w:rStyle w:val="AttributeTok"/>
+        </w:rPr>
+        <w:t xml:space="preserve">-fstack-protector-strong</w:t>
+      </w:r>
+      <w:r>
+        <w:rPr>
+          <w:rStyle w:val="NormalTok"/>
+        </w:rPr>
+        <w:t xml:space="preserve"> </w:t>
+      </w:r>
+      <w:r>
+        <w:rPr>
+          <w:rStyle w:val="AttributeTok"/>
+        </w:rPr>
+        <w:t xml:space="preserve">-Werror</w:t>
+      </w:r>
+      <w:r>
+        <w:rPr>
+          <w:rStyle w:val="OperatorTok"/>
+        </w:rPr>
+        <w:t xml:space="preserve">=</w:t>
+      </w:r>
+      <w:r>
+        <w:rPr>
+          <w:rStyle w:val="NormalTok"/>
+        </w:rPr>
+        <w:t xml:space="preserve">format-security </w:t>
+      </w:r>
+      <w:r>
+        <w:rPr>
+          <w:rStyle w:val="AttributeTok"/>
+        </w:rPr>
+        <w:t xml:space="preserve">-Werror</w:t>
+      </w:r>
+      <w:r>
+        <w:rPr>
+          <w:rStyle w:val="OperatorTok"/>
+        </w:rPr>
+        <w:t xml:space="preserve">=</w:t>
+      </w:r>
+      <w:r>
+        <w:rPr>
+          <w:rStyle w:val="NormalTok"/>
+        </w:rPr>
+        <w:t xml:space="preserve">implicit </w:t>
+      </w:r>
+      <w:r>
+        <w:rPr>
+          <w:rStyle w:val="AttributeTok"/>
+        </w:rPr>
+        <w:t xml:space="preserve">-Werror</w:t>
+      </w:r>
+      <w:r>
+        <w:rPr>
+          <w:rStyle w:val="OperatorTok"/>
+        </w:rPr>
+        <w:t xml:space="preserve">=</w:t>
+      </w:r>
+      <w:r>
+        <w:rPr>
+          <w:rStyle w:val="NormalTok"/>
+        </w:rPr>
+        <w:t xml:space="preserve">incompatible-pointer-types </w:t>
+      </w:r>
+      <w:r>
+        <w:rPr>
+          <w:rStyle w:val="AttributeTok"/>
+        </w:rPr>
+        <w:t xml:space="preserve">-Werror</w:t>
+      </w:r>
+      <w:r>
+        <w:rPr>
+          <w:rStyle w:val="OperatorTok"/>
+        </w:rPr>
+        <w:t xml:space="preserve">=</w:t>
+      </w:r>
+      <w:r>
+        <w:rPr>
+          <w:rStyle w:val="NormalTok"/>
+        </w:rPr>
+        <w:t xml:space="preserve">int-conversion build/release/lab.c.o build/release/main.c.o </w:t>
+      </w:r>
+      <w:r>
+        <w:rPr>
+          <w:rStyle w:val="AttributeTok"/>
+        </w:rPr>
+        <w:t xml:space="preserve">-o</w:t>
+      </w:r>
+      <w:r>
+        <w:rPr>
+          <w:rStyle w:val="NormalTok"/>
+        </w:rPr>
+        <w:t xml:space="preserve"> build/release/myapp </w:t>
+      </w:r>
+      <w:r>
+        <w:br/>
+      </w:r>
+      <w:r>
+        <w:rPr>
+          <w:rStyle w:val="VariableTok"/>
+        </w:rPr>
+        <w:t xml:space="preserve">make</w:t>
+      </w:r>
+      <w:r>
+        <w:rPr>
+          <w:rStyle w:val="OperatorTok"/>
+        </w:rPr>
+        <w:t xml:space="preserve">[</w:t>
+      </w:r>
+      <w:r>
+        <w:rPr>
+          <w:rStyle w:val="DecValTok"/>
+        </w:rPr>
+        <w:t xml:space="preserve">1</w:t>
+      </w:r>
+      <w:r>
+        <w:rPr>
+          <w:rStyle w:val="OperatorTok"/>
+        </w:rPr>
+        <w:t xml:space="preserve">]</w:t>
+      </w:r>
+      <w:r>
+        <w:rPr>
+          <w:rStyle w:val="ExtensionTok"/>
+        </w:rPr>
+        <w:t xml:space="preserve">:</w:t>
+      </w:r>
+      <w:r>
+        <w:rPr>
+          <w:rStyle w:val="NormalTok"/>
+        </w:rPr>
+        <w:t xml:space="preserve"> Leaving directory </w:t>
+      </w:r>
+      <w:r>
+        <w:rPr>
+          <w:rStyle w:val="StringTok"/>
+        </w:rPr>
+        <w:t xml:space="preserve">'/home/PERRYARYEE/Computer-Networks-CS525'</w:t>
+      </w:r>
+      <w:r>
+        <w:br/>
+      </w:r>
+      <w:r>
+        <w:rPr>
+          <w:rStyle w:val="VariableTok"/>
+        </w:rPr>
+        <w:t xml:space="preserve">make</w:t>
+      </w:r>
+      <w:r>
+        <w:rPr>
+          <w:rStyle w:val="OperatorTok"/>
+        </w:rPr>
+        <w:t xml:space="preserve">[</w:t>
+      </w:r>
+      <w:r>
+        <w:rPr>
+          <w:rStyle w:val="DecValTok"/>
+        </w:rPr>
+        <w:t xml:space="preserve">1</w:t>
+      </w:r>
+      <w:r>
+        <w:rPr>
+          <w:rStyle w:val="OperatorTok"/>
+        </w:rPr>
+        <w:t xml:space="preserve">]</w:t>
+      </w:r>
+      <w:r>
+        <w:rPr>
+          <w:rStyle w:val="ExtensionTok"/>
+        </w:rPr>
+        <w:t xml:space="preserve">:</w:t>
+      </w:r>
+      <w:r>
+        <w:rPr>
+          <w:rStyle w:val="NormalTok"/>
+        </w:rPr>
+        <w:t xml:space="preserve"> Entering directory </w:t>
+      </w:r>
+      <w:r>
+        <w:rPr>
+          <w:rStyle w:val="StringTok"/>
+        </w:rPr>
+        <w:t xml:space="preserve">'/home/PERRYARYEE/Computer-Networks-CS525'</w:t>
+      </w:r>
+      <w:r>
+        <w:br/>
+      </w:r>
+      <w:r>
+        <w:rPr>
+          <w:rStyle w:val="FunctionTok"/>
+        </w:rPr>
+        <w:t xml:space="preserve">mkdir</w:t>
+      </w:r>
+      <w:r>
+        <w:rPr>
+          <w:rStyle w:val="NormalTok"/>
+        </w:rPr>
+        <w:t xml:space="preserve"> </w:t>
+      </w:r>
+      <w:r>
+        <w:rPr>
+          <w:rStyle w:val="AttributeTok"/>
+        </w:rPr>
+        <w:t xml:space="preserve">-p</w:t>
+      </w:r>
+      <w:r>
+        <w:rPr>
+          <w:rStyle w:val="NormalTok"/>
+        </w:rPr>
+        <w:t xml:space="preserve"> build/tests</w:t>
+      </w:r>
+      <w:r>
+        <w:br/>
+      </w:r>
+      <w:r>
+        <w:rPr>
+          <w:rStyle w:val="FunctionTok"/>
+        </w:rPr>
+        <w:t xml:space="preserve">cc</w:t>
+      </w:r>
+      <w:r>
+        <w:rPr>
+          <w:rStyle w:val="NormalTok"/>
+        </w:rPr>
+        <w:t xml:space="preserve"> </w:t>
+      </w:r>
+      <w:r>
+        <w:rPr>
+          <w:rStyle w:val="AttributeTok"/>
+        </w:rPr>
         <w:t xml:space="preserve">-g</w:t>
       </w:r>
       <w:r>
@@ -510,6 +1758,705 @@
         <w:rPr>
           <w:rStyle w:val="AttributeTok"/>
         </w:rPr>
+        <w:t xml:space="preserve">-DTEST</w:t>
+      </w:r>
+      <w:r>
+        <w:rPr>
+          <w:rStyle w:val="NormalTok"/>
+        </w:rPr>
+        <w:t xml:space="preserve"> </w:t>
+      </w:r>
+      <w:r>
+        <w:rPr>
+          <w:rStyle w:val="AttributeTok"/>
+        </w:rPr>
+        <w:t xml:space="preserve">-fprofile-arcs</w:t>
+      </w:r>
+      <w:r>
+        <w:rPr>
+          <w:rStyle w:val="NormalTok"/>
+        </w:rPr>
+        <w:t xml:space="preserve"> </w:t>
+      </w:r>
+      <w:r>
+        <w:rPr>
+          <w:rStyle w:val="AttributeTok"/>
+        </w:rPr>
+        <w:t xml:space="preserve">-ftest-coverage</w:t>
+      </w:r>
+      <w:r>
+        <w:rPr>
+          <w:rStyle w:val="NormalTok"/>
+        </w:rPr>
+        <w:t xml:space="preserve"> </w:t>
+      </w:r>
+      <w:r>
+        <w:rPr>
+          <w:rStyle w:val="AttributeTok"/>
+        </w:rPr>
+        <w:t xml:space="preserve">-c</w:t>
+      </w:r>
+      <w:r>
+        <w:rPr>
+          <w:rStyle w:val="NormalTok"/>
+        </w:rPr>
+        <w:t xml:space="preserve"> src/lab.c </w:t>
+      </w:r>
+      <w:r>
+        <w:rPr>
+          <w:rStyle w:val="AttributeTok"/>
+        </w:rPr>
+        <w:t xml:space="preserve">-o</w:t>
+      </w:r>
+      <w:r>
+        <w:rPr>
+          <w:rStyle w:val="NormalTok"/>
+        </w:rPr>
+        <w:t xml:space="preserve"> build/tests/lab.c.o</w:t>
+      </w:r>
+      <w:r>
+        <w:br/>
+      </w:r>
+      <w:r>
+        <w:rPr>
+          <w:rStyle w:val="FunctionTok"/>
+        </w:rPr>
+        <w:t xml:space="preserve">mkdir</w:t>
+      </w:r>
+      <w:r>
+        <w:rPr>
+          <w:rStyle w:val="NormalTok"/>
+        </w:rPr>
+        <w:t xml:space="preserve"> </w:t>
+      </w:r>
+      <w:r>
+        <w:rPr>
+          <w:rStyle w:val="AttributeTok"/>
+        </w:rPr>
+        <w:t xml:space="preserve">-p</w:t>
+      </w:r>
+      <w:r>
+        <w:rPr>
+          <w:rStyle w:val="NormalTok"/>
+        </w:rPr>
+        <w:t xml:space="preserve"> build/tests</w:t>
+      </w:r>
+      <w:r>
+        <w:br/>
+      </w:r>
+      <w:r>
+        <w:rPr>
+          <w:rStyle w:val="FunctionTok"/>
+        </w:rPr>
+        <w:t xml:space="preserve">cc</w:t>
+      </w:r>
+      <w:r>
+        <w:rPr>
+          <w:rStyle w:val="NormalTok"/>
+        </w:rPr>
+        <w:t xml:space="preserve"> </w:t>
+      </w:r>
+      <w:r>
+        <w:rPr>
+          <w:rStyle w:val="AttributeTok"/>
+        </w:rPr>
+        <w:t xml:space="preserve">-g</w:t>
+      </w:r>
+      <w:r>
+        <w:rPr>
+          <w:rStyle w:val="NormalTok"/>
+        </w:rPr>
+        <w:t xml:space="preserve"> </w:t>
+      </w:r>
+      <w:r>
+        <w:rPr>
+          <w:rStyle w:val="AttributeTok"/>
+        </w:rPr>
+        <w:t xml:space="preserve">-O0</w:t>
+      </w:r>
+      <w:r>
+        <w:rPr>
+          <w:rStyle w:val="NormalTok"/>
+        </w:rPr>
+        <w:t xml:space="preserve"> </w:t>
+      </w:r>
+      <w:r>
+        <w:rPr>
+          <w:rStyle w:val="AttributeTok"/>
+        </w:rPr>
+        <w:t xml:space="preserve">-DTEST</w:t>
+      </w:r>
+      <w:r>
+        <w:rPr>
+          <w:rStyle w:val="NormalTok"/>
+        </w:rPr>
+        <w:t xml:space="preserve"> </w:t>
+      </w:r>
+      <w:r>
+        <w:rPr>
+          <w:rStyle w:val="AttributeTok"/>
+        </w:rPr>
+        <w:t xml:space="preserve">-fprofile-arcs</w:t>
+      </w:r>
+      <w:r>
+        <w:rPr>
+          <w:rStyle w:val="NormalTok"/>
+        </w:rPr>
+        <w:t xml:space="preserve"> </w:t>
+      </w:r>
+      <w:r>
+        <w:rPr>
+          <w:rStyle w:val="AttributeTok"/>
+        </w:rPr>
+        <w:t xml:space="preserve">-ftest-coverage</w:t>
+      </w:r>
+      <w:r>
+        <w:rPr>
+          <w:rStyle w:val="NormalTok"/>
+        </w:rPr>
+        <w:t xml:space="preserve"> </w:t>
+      </w:r>
+      <w:r>
+        <w:rPr>
+          <w:rStyle w:val="AttributeTok"/>
+        </w:rPr>
+        <w:t xml:space="preserve">-c</w:t>
+      </w:r>
+      <w:r>
+        <w:rPr>
+          <w:rStyle w:val="NormalTok"/>
+        </w:rPr>
+        <w:t xml:space="preserve"> src/main.c </w:t>
+      </w:r>
+      <w:r>
+        <w:rPr>
+          <w:rStyle w:val="AttributeTok"/>
+        </w:rPr>
+        <w:t xml:space="preserve">-o</w:t>
+      </w:r>
+      <w:r>
+        <w:rPr>
+          <w:rStyle w:val="NormalTok"/>
+        </w:rPr>
+        <w:t xml:space="preserve"> build/tests/main.c.o</w:t>
+      </w:r>
+      <w:r>
+        <w:br/>
+      </w:r>
+      <w:r>
+        <w:rPr>
+          <w:rStyle w:val="FunctionTok"/>
+        </w:rPr>
+        <w:t xml:space="preserve">mkdir</w:t>
+      </w:r>
+      <w:r>
+        <w:rPr>
+          <w:rStyle w:val="NormalTok"/>
+        </w:rPr>
+        <w:t xml:space="preserve"> </w:t>
+      </w:r>
+      <w:r>
+        <w:rPr>
+          <w:rStyle w:val="AttributeTok"/>
+        </w:rPr>
+        <w:t xml:space="preserve">-p</w:t>
+      </w:r>
+      <w:r>
+        <w:rPr>
+          <w:rStyle w:val="NormalTok"/>
+        </w:rPr>
+        <w:t xml:space="preserve"> build/tests/harness/</w:t>
+      </w:r>
+      <w:r>
+        <w:br/>
+      </w:r>
+      <w:r>
+        <w:rPr>
+          <w:rStyle w:val="FunctionTok"/>
+        </w:rPr>
+        <w:t xml:space="preserve">cc</w:t>
+      </w:r>
+      <w:r>
+        <w:rPr>
+          <w:rStyle w:val="NormalTok"/>
+        </w:rPr>
+        <w:t xml:space="preserve"> </w:t>
+      </w:r>
+      <w:r>
+        <w:rPr>
+          <w:rStyle w:val="AttributeTok"/>
+        </w:rPr>
+        <w:t xml:space="preserve">-g</w:t>
+      </w:r>
+      <w:r>
+        <w:rPr>
+          <w:rStyle w:val="NormalTok"/>
+        </w:rPr>
+        <w:t xml:space="preserve"> </w:t>
+      </w:r>
+      <w:r>
+        <w:rPr>
+          <w:rStyle w:val="AttributeTok"/>
+        </w:rPr>
+        <w:t xml:space="preserve">-O0</w:t>
+      </w:r>
+      <w:r>
+        <w:rPr>
+          <w:rStyle w:val="NormalTok"/>
+        </w:rPr>
+        <w:t xml:space="preserve"> </w:t>
+      </w:r>
+      <w:r>
+        <w:rPr>
+          <w:rStyle w:val="AttributeTok"/>
+        </w:rPr>
+        <w:t xml:space="preserve">-DTEST</w:t>
+      </w:r>
+      <w:r>
+        <w:rPr>
+          <w:rStyle w:val="NormalTok"/>
+        </w:rPr>
+        <w:t xml:space="preserve"> </w:t>
+      </w:r>
+      <w:r>
+        <w:rPr>
+          <w:rStyle w:val="AttributeTok"/>
+        </w:rPr>
+        <w:t xml:space="preserve">-fprofile-arcs</w:t>
+      </w:r>
+      <w:r>
+        <w:rPr>
+          <w:rStyle w:val="NormalTok"/>
+        </w:rPr>
+        <w:t xml:space="preserve"> </w:t>
+      </w:r>
+      <w:r>
+        <w:rPr>
+          <w:rStyle w:val="AttributeTok"/>
+        </w:rPr>
+        <w:t xml:space="preserve">-ftest-coverage</w:t>
+      </w:r>
+      <w:r>
+        <w:rPr>
+          <w:rStyle w:val="NormalTok"/>
+        </w:rPr>
+        <w:t xml:space="preserve"> </w:t>
+      </w:r>
+      <w:r>
+        <w:rPr>
+          <w:rStyle w:val="AttributeTok"/>
+        </w:rPr>
+        <w:t xml:space="preserve">-c</w:t>
+      </w:r>
+      <w:r>
+        <w:rPr>
+          <w:rStyle w:val="NormalTok"/>
+        </w:rPr>
+        <w:t xml:space="preserve"> tests/harness/unity.c </w:t>
+      </w:r>
+      <w:r>
+        <w:rPr>
+          <w:rStyle w:val="AttributeTok"/>
+        </w:rPr>
+        <w:t xml:space="preserve">-o</w:t>
+      </w:r>
+      <w:r>
+        <w:rPr>
+          <w:rStyle w:val="NormalTok"/>
+        </w:rPr>
+        <w:t xml:space="preserve"> build/tests/harness/unity.c.o</w:t>
+      </w:r>
+      <w:r>
+        <w:br/>
+      </w:r>
+      <w:r>
+        <w:rPr>
+          <w:rStyle w:val="FunctionTok"/>
+        </w:rPr>
+        <w:t xml:space="preserve">mkdir</w:t>
+      </w:r>
+      <w:r>
+        <w:rPr>
+          <w:rStyle w:val="NormalTok"/>
+        </w:rPr>
+        <w:t xml:space="preserve"> </w:t>
+      </w:r>
+      <w:r>
+        <w:rPr>
+          <w:rStyle w:val="AttributeTok"/>
+        </w:rPr>
+        <w:t xml:space="preserve">-p</w:t>
+      </w:r>
+      <w:r>
+        <w:rPr>
+          <w:rStyle w:val="NormalTok"/>
+        </w:rPr>
+        <w:t xml:space="preserve"> build/tests/</w:t>
+      </w:r>
+      <w:r>
+        <w:br/>
+      </w:r>
+      <w:r>
+        <w:rPr>
+          <w:rStyle w:val="FunctionTok"/>
+        </w:rPr>
+        <w:t xml:space="preserve">cc</w:t>
+      </w:r>
+      <w:r>
+        <w:rPr>
+          <w:rStyle w:val="NormalTok"/>
+        </w:rPr>
+        <w:t xml:space="preserve"> </w:t>
+      </w:r>
+      <w:r>
+        <w:rPr>
+          <w:rStyle w:val="AttributeTok"/>
+        </w:rPr>
+        <w:t xml:space="preserve">-g</w:t>
+      </w:r>
+      <w:r>
+        <w:rPr>
+          <w:rStyle w:val="NormalTok"/>
+        </w:rPr>
+        <w:t xml:space="preserve"> </w:t>
+      </w:r>
+      <w:r>
+        <w:rPr>
+          <w:rStyle w:val="AttributeTok"/>
+        </w:rPr>
+        <w:t xml:space="preserve">-O0</w:t>
+      </w:r>
+      <w:r>
+        <w:rPr>
+          <w:rStyle w:val="NormalTok"/>
+        </w:rPr>
+        <w:t xml:space="preserve"> </w:t>
+      </w:r>
+      <w:r>
+        <w:rPr>
+          <w:rStyle w:val="AttributeTok"/>
+        </w:rPr>
+        <w:t xml:space="preserve">-DTEST</w:t>
+      </w:r>
+      <w:r>
+        <w:rPr>
+          <w:rStyle w:val="NormalTok"/>
+        </w:rPr>
+        <w:t xml:space="preserve"> </w:t>
+      </w:r>
+      <w:r>
+        <w:rPr>
+          <w:rStyle w:val="AttributeTok"/>
+        </w:rPr>
+        <w:t xml:space="preserve">-fprofile-arcs</w:t>
+      </w:r>
+      <w:r>
+        <w:rPr>
+          <w:rStyle w:val="NormalTok"/>
+        </w:rPr>
+        <w:t xml:space="preserve"> </w:t>
+      </w:r>
+      <w:r>
+        <w:rPr>
+          <w:rStyle w:val="AttributeTok"/>
+        </w:rPr>
+        <w:t xml:space="preserve">-ftest-coverage</w:t>
+      </w:r>
+      <w:r>
+        <w:rPr>
+          <w:rStyle w:val="NormalTok"/>
+        </w:rPr>
+        <w:t xml:space="preserve"> </w:t>
+      </w:r>
+      <w:r>
+        <w:rPr>
+          <w:rStyle w:val="AttributeTok"/>
+        </w:rPr>
+        <w:t xml:space="preserve">-c</w:t>
+      </w:r>
+      <w:r>
+        <w:rPr>
+          <w:rStyle w:val="NormalTok"/>
+        </w:rPr>
+        <w:t xml:space="preserve"> tests/lab-test.c </w:t>
+      </w:r>
+      <w:r>
+        <w:rPr>
+          <w:rStyle w:val="AttributeTok"/>
+        </w:rPr>
+        <w:t xml:space="preserve">-o</w:t>
+      </w:r>
+      <w:r>
+        <w:rPr>
+          <w:rStyle w:val="NormalTok"/>
+        </w:rPr>
+        <w:t xml:space="preserve"> build/tests/lab-test.c.o</w:t>
+      </w:r>
+      <w:r>
+        <w:br/>
+      </w:r>
+      <w:r>
+        <w:rPr>
+          <w:rStyle w:val="FunctionTok"/>
+        </w:rPr>
+        <w:t xml:space="preserve">cc</w:t>
+      </w:r>
+      <w:r>
+        <w:rPr>
+          <w:rStyle w:val="NormalTok"/>
+        </w:rPr>
+        <w:t xml:space="preserve"> </w:t>
+      </w:r>
+      <w:r>
+        <w:rPr>
+          <w:rStyle w:val="AttributeTok"/>
+        </w:rPr>
+        <w:t xml:space="preserve">-g</w:t>
+      </w:r>
+      <w:r>
+        <w:rPr>
+          <w:rStyle w:val="NormalTok"/>
+        </w:rPr>
+        <w:t xml:space="preserve"> </w:t>
+      </w:r>
+      <w:r>
+        <w:rPr>
+          <w:rStyle w:val="AttributeTok"/>
+        </w:rPr>
+        <w:t xml:space="preserve">-O0</w:t>
+      </w:r>
+      <w:r>
+        <w:rPr>
+          <w:rStyle w:val="NormalTok"/>
+        </w:rPr>
+        <w:t xml:space="preserve"> </w:t>
+      </w:r>
+      <w:r>
+        <w:rPr>
+          <w:rStyle w:val="AttributeTok"/>
+        </w:rPr>
+        <w:t xml:space="preserve">-DTEST</w:t>
+      </w:r>
+      <w:r>
+        <w:rPr>
+          <w:rStyle w:val="NormalTok"/>
+        </w:rPr>
+        <w:t xml:space="preserve"> </w:t>
+      </w:r>
+      <w:r>
+        <w:rPr>
+          <w:rStyle w:val="AttributeTok"/>
+        </w:rPr>
+        <w:t xml:space="preserve">-fprofile-arcs</w:t>
+      </w:r>
+      <w:r>
+        <w:rPr>
+          <w:rStyle w:val="NormalTok"/>
+        </w:rPr>
+        <w:t xml:space="preserve"> </w:t>
+      </w:r>
+      <w:r>
+        <w:rPr>
+          <w:rStyle w:val="AttributeTok"/>
+        </w:rPr>
+        <w:t xml:space="preserve">-ftest-coverage</w:t>
+      </w:r>
+      <w:r>
+        <w:rPr>
+          <w:rStyle w:val="NormalTok"/>
+        </w:rPr>
+        <w:t xml:space="preserve"> build/tests/lab.c.o build/tests/main.c.o build/tests/harness/unity.c.o build/tests/lab-test.c.o </w:t>
+      </w:r>
+      <w:r>
+        <w:rPr>
+          <w:rStyle w:val="AttributeTok"/>
+        </w:rPr>
+        <w:t xml:space="preserve">-o</w:t>
+      </w:r>
+      <w:r>
+        <w:rPr>
+          <w:rStyle w:val="NormalTok"/>
+        </w:rPr>
+        <w:t xml:space="preserve"> build/tests/myapp_t </w:t>
+      </w:r>
+      <w:r>
+        <w:rPr>
+          <w:rStyle w:val="AttributeTok"/>
+        </w:rPr>
+        <w:t xml:space="preserve">-fprofile-arcs</w:t>
+      </w:r>
+      <w:r>
+        <w:rPr>
+          <w:rStyle w:val="NormalTok"/>
+        </w:rPr>
+        <w:t xml:space="preserve"> </w:t>
+      </w:r>
+      <w:r>
+        <w:rPr>
+          <w:rStyle w:val="AttributeTok"/>
+        </w:rPr>
+        <w:t xml:space="preserve">-ftest-coverage</w:t>
+      </w:r>
+      <w:r>
+        <w:br/>
+      </w:r>
+      <w:r>
+        <w:rPr>
+          <w:rStyle w:val="VariableTok"/>
+        </w:rPr>
+        <w:t xml:space="preserve">make</w:t>
+      </w:r>
+      <w:r>
+        <w:rPr>
+          <w:rStyle w:val="OperatorTok"/>
+        </w:rPr>
+        <w:t xml:space="preserve">[</w:t>
+      </w:r>
+      <w:r>
+        <w:rPr>
+          <w:rStyle w:val="DecValTok"/>
+        </w:rPr>
+        <w:t xml:space="preserve">1</w:t>
+      </w:r>
+      <w:r>
+        <w:rPr>
+          <w:rStyle w:val="OperatorTok"/>
+        </w:rPr>
+        <w:t xml:space="preserve">]</w:t>
+      </w:r>
+      <w:r>
+        <w:rPr>
+          <w:rStyle w:val="ExtensionTok"/>
+        </w:rPr>
+        <w:t xml:space="preserve">:</w:t>
+      </w:r>
+      <w:r>
+        <w:rPr>
+          <w:rStyle w:val="NormalTok"/>
+        </w:rPr>
+        <w:t xml:space="preserve"> Leaving directory </w:t>
+      </w:r>
+      <w:r>
+        <w:rPr>
+          <w:rStyle w:val="StringTok"/>
+        </w:rPr>
+        <w:t xml:space="preserve">'/home/PERRYARYEE/Computer-Networks-CS525'</w:t>
+      </w:r>
+      <w:r>
+        <w:br/>
+      </w:r>
+      <w:r>
+        <w:rPr>
+          <w:rStyle w:val="VariableTok"/>
+        </w:rPr>
+        <w:t xml:space="preserve">make</w:t>
+      </w:r>
+      <w:r>
+        <w:rPr>
+          <w:rStyle w:val="OperatorTok"/>
+        </w:rPr>
+        <w:t xml:space="preserve">[</w:t>
+      </w:r>
+      <w:r>
+        <w:rPr>
+          <w:rStyle w:val="DecValTok"/>
+        </w:rPr>
+        <w:t xml:space="preserve">1</w:t>
+      </w:r>
+      <w:r>
+        <w:rPr>
+          <w:rStyle w:val="OperatorTok"/>
+        </w:rPr>
+        <w:t xml:space="preserve">]</w:t>
+      </w:r>
+      <w:r>
+        <w:rPr>
+          <w:rStyle w:val="ExtensionTok"/>
+        </w:rPr>
+        <w:t xml:space="preserve">:</w:t>
+      </w:r>
+      <w:r>
+        <w:rPr>
+          <w:rStyle w:val="NormalTok"/>
+        </w:rPr>
+        <w:t xml:space="preserve"> Entering directory </w:t>
+      </w:r>
+      <w:r>
+        <w:rPr>
+          <w:rStyle w:val="StringTok"/>
+        </w:rPr>
+        <w:t xml:space="preserve">'/home/PERRYARYEE/Computer-Networks-CS525'</w:t>
+      </w:r>
+      <w:r>
+        <w:br/>
+      </w:r>
+      <w:r>
+        <w:rPr>
+          <w:rStyle w:val="FunctionTok"/>
+        </w:rPr>
+        <w:t xml:space="preserve">mkdir</w:t>
+      </w:r>
+      <w:r>
+        <w:rPr>
+          <w:rStyle w:val="NormalTok"/>
+        </w:rPr>
+        <w:t xml:space="preserve"> </w:t>
+      </w:r>
+      <w:r>
+        <w:rPr>
+          <w:rStyle w:val="AttributeTok"/>
+        </w:rPr>
+        <w:t xml:space="preserve">-p</w:t>
+      </w:r>
+      <w:r>
+        <w:rPr>
+          <w:rStyle w:val="NormalTok"/>
+        </w:rPr>
+        <w:t xml:space="preserve"> build/debug-test</w:t>
+      </w:r>
+      <w:r>
+        <w:br/>
+      </w:r>
+      <w:r>
+        <w:rPr>
+          <w:rStyle w:val="FunctionTok"/>
+        </w:rPr>
+        <w:t xml:space="preserve">cc</w:t>
+      </w:r>
+      <w:r>
+        <w:rPr>
+          <w:rStyle w:val="NormalTok"/>
+        </w:rPr>
+        <w:t xml:space="preserve"> </w:t>
+      </w:r>
+      <w:r>
+        <w:rPr>
+          <w:rStyle w:val="AttributeTok"/>
+        </w:rPr>
+        <w:t xml:space="preserve">-g</w:t>
+      </w:r>
+      <w:r>
+        <w:rPr>
+          <w:rStyle w:val="NormalTok"/>
+        </w:rPr>
+        <w:t xml:space="preserve"> </w:t>
+      </w:r>
+      <w:r>
+        <w:rPr>
+          <w:rStyle w:val="AttributeTok"/>
+        </w:rPr>
+        <w:t xml:space="preserve">-O0</w:t>
+      </w:r>
+      <w:r>
+        <w:rPr>
+          <w:rStyle w:val="NormalTok"/>
+        </w:rPr>
+        <w:t xml:space="preserve"> </w:t>
+      </w:r>
+      <w:r>
+        <w:rPr>
+          <w:rStyle w:val="AttributeTok"/>
+        </w:rPr>
         <w:t xml:space="preserve">-DDEBUG</w:t>
       </w:r>
       <w:r>
@@ -522,6 +2469,18 @@
         <w:rPr>
           <w:rStyle w:val="AttributeTok"/>
         </w:rPr>
+        <w:t xml:space="preserve">-DTEST</w:t>
+      </w:r>
+      <w:r>
+        <w:rPr>
+          <w:rStyle w:val="NormalTok"/>
+        </w:rPr>
+        <w:t xml:space="preserve"> </w:t>
+      </w:r>
+      <w:r>
+        <w:rPr>
+          <w:rStyle w:val="AttributeTok"/>
+        </w:rPr>
         <w:t xml:space="preserve">-fno-omit-frame-pointer</w:t>
       </w:r>
       <w:r>
@@ -570,7 +2529,7 @@
         <w:rPr>
           <w:rStyle w:val="NormalTok"/>
         </w:rPr>
-        <w:t xml:space="preserve"> build/debug/lab.c.o</w:t>
+        <w:t xml:space="preserve"> build/debug-test/lab.c.o</w:t>
       </w:r>
       <w:r>
         <w:br/>
@@ -579,6 +2538,33 @@
         <w:rPr>
           <w:rStyle w:val="FunctionTok"/>
         </w:rPr>
+        <w:t xml:space="preserve">mkdir</w:t>
+      </w:r>
+      <w:r>
+        <w:rPr>
+          <w:rStyle w:val="NormalTok"/>
+        </w:rPr>
+        <w:t xml:space="preserve"> </w:t>
+      </w:r>
+      <w:r>
+        <w:rPr>
+          <w:rStyle w:val="AttributeTok"/>
+        </w:rPr>
+        <w:t xml:space="preserve">-p</w:t>
+      </w:r>
+      <w:r>
+        <w:rPr>
+          <w:rStyle w:val="NormalTok"/>
+        </w:rPr>
+        <w:t xml:space="preserve"> build/debug-test</w:t>
+      </w:r>
+      <w:r>
+        <w:br/>
+      </w:r>
+      <w:r>
+        <w:rPr>
+          <w:rStyle w:val="FunctionTok"/>
+        </w:rPr>
         <w:t xml:space="preserve">cc</w:t>
       </w:r>
       <w:r>
@@ -627,6 +2613,18 @@
         <w:rPr>
           <w:rStyle w:val="AttributeTok"/>
         </w:rPr>
+        <w:t xml:space="preserve">-DTEST</w:t>
+      </w:r>
+      <w:r>
+        <w:rPr>
+          <w:rStyle w:val="NormalTok"/>
+        </w:rPr>
+        <w:t xml:space="preserve"> </w:t>
+      </w:r>
+      <w:r>
+        <w:rPr>
+          <w:rStyle w:val="AttributeTok"/>
+        </w:rPr>
         <w:t xml:space="preserve">-fno-omit-frame-pointer</w:t>
       </w:r>
       <w:r>
@@ -651,7 +2649,19 @@
         <w:rPr>
           <w:rStyle w:val="NormalTok"/>
         </w:rPr>
-        <w:t xml:space="preserve">address build/debug/main.c.o build/debug/lab.c.o </w:t>
+        <w:t xml:space="preserve">address </w:t>
+      </w:r>
+      <w:r>
+        <w:rPr>
+          <w:rStyle w:val="AttributeTok"/>
+        </w:rPr>
+        <w:t xml:space="preserve">-c</w:t>
+      </w:r>
+      <w:r>
+        <w:rPr>
+          <w:rStyle w:val="NormalTok"/>
+        </w:rPr>
+        <w:t xml:space="preserve"> src/main.c </w:t>
       </w:r>
       <w:r>
         <w:rPr>
@@ -663,7 +2673,109 @@
         <w:rPr>
           <w:rStyle w:val="NormalTok"/>
         </w:rPr>
-        <w:t xml:space="preserve"> build/debug/myapp_d </w:t>
+        <w:t xml:space="preserve"> build/debug-test/main.c.o</w:t>
+      </w:r>
+      <w:r>
+        <w:br/>
+      </w:r>
+      <w:r>
+        <w:rPr>
+          <w:rStyle w:val="FunctionTok"/>
+        </w:rPr>
+        <w:t xml:space="preserve">mkdir</w:t>
+      </w:r>
+      <w:r>
+        <w:rPr>
+          <w:rStyle w:val="NormalTok"/>
+        </w:rPr>
+        <w:t xml:space="preserve"> </w:t>
+      </w:r>
+      <w:r>
+        <w:rPr>
+          <w:rStyle w:val="AttributeTok"/>
+        </w:rPr>
+        <w:t xml:space="preserve">-p</w:t>
+      </w:r>
+      <w:r>
+        <w:rPr>
+          <w:rStyle w:val="NormalTok"/>
+        </w:rPr>
+        <w:t xml:space="preserve"> build/debug-test/harness/</w:t>
+      </w:r>
+      <w:r>
+        <w:br/>
+      </w:r>
+      <w:r>
+        <w:rPr>
+          <w:rStyle w:val="FunctionTok"/>
+        </w:rPr>
+        <w:t xml:space="preserve">cc</w:t>
+      </w:r>
+      <w:r>
+        <w:rPr>
+          <w:rStyle w:val="NormalTok"/>
+        </w:rPr>
+        <w:t xml:space="preserve"> </w:t>
+      </w:r>
+      <w:r>
+        <w:rPr>
+          <w:rStyle w:val="AttributeTok"/>
+        </w:rPr>
+        <w:t xml:space="preserve">-g</w:t>
+      </w:r>
+      <w:r>
+        <w:rPr>
+          <w:rStyle w:val="NormalTok"/>
+        </w:rPr>
+        <w:t xml:space="preserve"> </w:t>
+      </w:r>
+      <w:r>
+        <w:rPr>
+          <w:rStyle w:val="AttributeTok"/>
+        </w:rPr>
+        <w:t xml:space="preserve">-O0</w:t>
+      </w:r>
+      <w:r>
+        <w:rPr>
+          <w:rStyle w:val="NormalTok"/>
+        </w:rPr>
+        <w:t xml:space="preserve"> </w:t>
+      </w:r>
+      <w:r>
+        <w:rPr>
+          <w:rStyle w:val="AttributeTok"/>
+        </w:rPr>
+        <w:t xml:space="preserve">-DDEBUG</w:t>
+      </w:r>
+      <w:r>
+        <w:rPr>
+          <w:rStyle w:val="NormalTok"/>
+        </w:rPr>
+        <w:t xml:space="preserve"> </w:t>
+      </w:r>
+      <w:r>
+        <w:rPr>
+          <w:rStyle w:val="AttributeTok"/>
+        </w:rPr>
+        <w:t xml:space="preserve">-DTEST</w:t>
+      </w:r>
+      <w:r>
+        <w:rPr>
+          <w:rStyle w:val="NormalTok"/>
+        </w:rPr>
+        <w:t xml:space="preserve"> </w:t>
+      </w:r>
+      <w:r>
+        <w:rPr>
+          <w:rStyle w:val="AttributeTok"/>
+        </w:rPr>
+        <w:t xml:space="preserve">-fno-omit-frame-pointer</w:t>
+      </w:r>
+      <w:r>
+        <w:rPr>
+          <w:rStyle w:val="NormalTok"/>
+        </w:rPr>
+        <w:t xml:space="preserve"> </w:t>
       </w:r>
       <w:r>
         <w:rPr>
@@ -681,97 +2793,31 @@
         <w:rPr>
           <w:rStyle w:val="NormalTok"/>
         </w:rPr>
-        <w:t xml:space="preserve">address</w:t>
-      </w:r>
-      <w:r>
-        <w:br/>
-      </w:r>
-      <w:r>
-        <w:rPr>
-          <w:rStyle w:val="VariableTok"/>
-        </w:rPr>
-        <w:t xml:space="preserve">make</w:t>
-      </w:r>
-      <w:r>
-        <w:rPr>
-          <w:rStyle w:val="OperatorTok"/>
-        </w:rPr>
-        <w:t xml:space="preserve">[</w:t>
-      </w:r>
-      <w:r>
-        <w:rPr>
-          <w:rStyle w:val="DecValTok"/>
-        </w:rPr>
-        <w:t xml:space="preserve">1</w:t>
-      </w:r>
-      <w:r>
-        <w:rPr>
-          <w:rStyle w:val="OperatorTok"/>
-        </w:rPr>
-        <w:t xml:space="preserve">]</w:t>
-      </w:r>
-      <w:r>
-        <w:rPr>
-          <w:rStyle w:val="ExtensionTok"/>
-        </w:rPr>
-        <w:t xml:space="preserve">:</w:t>
-      </w:r>
-      <w:r>
-        <w:rPr>
-          <w:rStyle w:val="NormalTok"/>
-        </w:rPr>
-        <w:t xml:space="preserve"> Leaving directory </w:t>
-      </w:r>
-      <w:r>
-        <w:rPr>
-          <w:rStyle w:val="StringTok"/>
-        </w:rPr>
-        <w:t xml:space="preserve">'/home/PERRYARYEE/Computer-Networks-CS525'</w:t>
-      </w:r>
-      <w:r>
-        <w:br/>
-      </w:r>
-      <w:r>
-        <w:rPr>
-          <w:rStyle w:val="VariableTok"/>
-        </w:rPr>
-        <w:t xml:space="preserve">make</w:t>
-      </w:r>
-      <w:r>
-        <w:rPr>
-          <w:rStyle w:val="OperatorTok"/>
-        </w:rPr>
-        <w:t xml:space="preserve">[</w:t>
-      </w:r>
-      <w:r>
-        <w:rPr>
-          <w:rStyle w:val="DecValTok"/>
-        </w:rPr>
-        <w:t xml:space="preserve">1</w:t>
-      </w:r>
-      <w:r>
-        <w:rPr>
-          <w:rStyle w:val="OperatorTok"/>
-        </w:rPr>
-        <w:t xml:space="preserve">]</w:t>
-      </w:r>
-      <w:r>
-        <w:rPr>
-          <w:rStyle w:val="ExtensionTok"/>
-        </w:rPr>
-        <w:t xml:space="preserve">:</w:t>
-      </w:r>
-      <w:r>
-        <w:rPr>
-          <w:rStyle w:val="NormalTok"/>
-        </w:rPr>
-        <w:t xml:space="preserve"> Entering directory </w:t>
-      </w:r>
-      <w:r>
-        <w:rPr>
-          <w:rStyle w:val="StringTok"/>
-        </w:rPr>
-        <w:t xml:space="preserve">'/home/PERRYARYEE/Computer-Networks-CS525'</w:t>
+        <w:t xml:space="preserve">address </w:t>
+      </w:r>
+      <w:r>
+        <w:rPr>
+          <w:rStyle w:val="AttributeTok"/>
+        </w:rPr>
+        <w:t xml:space="preserve">-c</w:t>
+      </w:r>
+      <w:r>
+        <w:rPr>
+          <w:rStyle w:val="NormalTok"/>
+        </w:rPr>
+        <w:t xml:space="preserve"> tests/harness/unity.c </w:t>
+      </w:r>
+      <w:r>
+        <w:rPr>
+          <w:rStyle w:val="AttributeTok"/>
+        </w:rPr>
+        <w:t xml:space="preserve">-o</w:t>
+      </w:r>
+      <w:r>
+        <w:rPr>
+          <w:rStyle w:val="NormalTok"/>
+        </w:rPr>
+        <w:t xml:space="preserve"> build/debug-test/harness/unity.c.o</w:t>
       </w:r>
       <w:r>
         <w:br/>
@@ -798,7 +2844,7 @@
         <w:rPr>
           <w:rStyle w:val="NormalTok"/>
         </w:rPr>
-        <w:t xml:space="preserve"> build/release</w:t>
+        <w:t xml:space="preserve"> build/debug-test/</w:t>
       </w:r>
       <w:r>
         <w:br/>
@@ -819,91 +2865,67 @@
         <w:rPr>
           <w:rStyle w:val="AttributeTok"/>
         </w:rPr>
-        <w:t xml:space="preserve">-Wall</w:t>
-      </w:r>
-      <w:r>
-        <w:rPr>
-          <w:rStyle w:val="NormalTok"/>
-        </w:rPr>
-        <w:t xml:space="preserve"> </w:t>
-      </w:r>
-      <w:r>
-        <w:rPr>
-          <w:rStyle w:val="AttributeTok"/>
-        </w:rPr>
-        <w:t xml:space="preserve">-Wextra</w:t>
-      </w:r>
-      <w:r>
-        <w:rPr>
-          <w:rStyle w:val="NormalTok"/>
-        </w:rPr>
-        <w:t xml:space="preserve"> </w:t>
-      </w:r>
-      <w:r>
-        <w:rPr>
-          <w:rStyle w:val="AttributeTok"/>
-        </w:rPr>
-        <w:t xml:space="preserve">-O2</w:t>
-      </w:r>
-      <w:r>
-        <w:rPr>
-          <w:rStyle w:val="NormalTok"/>
-        </w:rPr>
-        <w:t xml:space="preserve"> </w:t>
-      </w:r>
-      <w:r>
-        <w:rPr>
-          <w:rStyle w:val="AttributeTok"/>
-        </w:rPr>
-        <w:t xml:space="preserve">-fPIE</w:t>
-      </w:r>
-      <w:r>
-        <w:rPr>
-          <w:rStyle w:val="NormalTok"/>
-        </w:rPr>
-        <w:t xml:space="preserve"> </w:t>
-      </w:r>
-      <w:r>
-        <w:rPr>
-          <w:rStyle w:val="AttributeTok"/>
-        </w:rPr>
-        <w:t xml:space="preserve">-MMD</w:t>
-      </w:r>
-      <w:r>
-        <w:rPr>
-          <w:rStyle w:val="NormalTok"/>
-        </w:rPr>
-        <w:t xml:space="preserve"> </w:t>
-      </w:r>
-      <w:r>
-        <w:rPr>
-          <w:rStyle w:val="AttributeTok"/>
-        </w:rPr>
-        <w:t xml:space="preserve">-MP</w:t>
-      </w:r>
-      <w:r>
-        <w:rPr>
-          <w:rStyle w:val="NormalTok"/>
-        </w:rPr>
-        <w:t xml:space="preserve"> </w:t>
-      </w:r>
-      <w:r>
-        <w:rPr>
-          <w:rStyle w:val="AttributeTok"/>
-        </w:rPr>
-        <w:t xml:space="preserve">-Wformat</w:t>
-      </w:r>
-      <w:r>
-        <w:rPr>
-          <w:rStyle w:val="NormalTok"/>
-        </w:rPr>
-        <w:t xml:space="preserve"> </w:t>
-      </w:r>
-      <w:r>
-        <w:rPr>
-          <w:rStyle w:val="AttributeTok"/>
-        </w:rPr>
-        <w:t xml:space="preserve">-Wformat</w:t>
+        <w:t xml:space="preserve">-g</w:t>
+      </w:r>
+      <w:r>
+        <w:rPr>
+          <w:rStyle w:val="NormalTok"/>
+        </w:rPr>
+        <w:t xml:space="preserve"> </w:t>
+      </w:r>
+      <w:r>
+        <w:rPr>
+          <w:rStyle w:val="AttributeTok"/>
+        </w:rPr>
+        <w:t xml:space="preserve">-O0</w:t>
+      </w:r>
+      <w:r>
+        <w:rPr>
+          <w:rStyle w:val="NormalTok"/>
+        </w:rPr>
+        <w:t xml:space="preserve"> </w:t>
+      </w:r>
+      <w:r>
+        <w:rPr>
+          <w:rStyle w:val="AttributeTok"/>
+        </w:rPr>
+        <w:t xml:space="preserve">-DDEBUG</w:t>
+      </w:r>
+      <w:r>
+        <w:rPr>
+          <w:rStyle w:val="NormalTok"/>
+        </w:rPr>
+        <w:t xml:space="preserve"> </w:t>
+      </w:r>
+      <w:r>
+        <w:rPr>
+          <w:rStyle w:val="AttributeTok"/>
+        </w:rPr>
+        <w:t xml:space="preserve">-DTEST</w:t>
+      </w:r>
+      <w:r>
+        <w:rPr>
+          <w:rStyle w:val="NormalTok"/>
+        </w:rPr>
+        <w:t xml:space="preserve"> </w:t>
+      </w:r>
+      <w:r>
+        <w:rPr>
+          <w:rStyle w:val="AttributeTok"/>
+        </w:rPr>
+        <w:t xml:space="preserve">-fno-omit-frame-pointer</w:t>
+      </w:r>
+      <w:r>
+        <w:rPr>
+          <w:rStyle w:val="NormalTok"/>
+        </w:rPr>
+        <w:t xml:space="preserve"> </w:t>
+      </w:r>
+      <w:r>
+        <w:rPr>
+          <w:rStyle w:val="AttributeTok"/>
+        </w:rPr>
+        <w:t xml:space="preserve">-fsanitize</w:t>
       </w:r>
       <w:r>
         <w:rPr>
@@ -915,61 +2937,112 @@
         <w:rPr>
           <w:rStyle w:val="NormalTok"/>
         </w:rPr>
-        <w:t xml:space="preserve">2 </w:t>
-      </w:r>
-      <w:r>
-        <w:rPr>
-          <w:rStyle w:val="AttributeTok"/>
-        </w:rPr>
-        <w:t xml:space="preserve">-Wconversion</w:t>
-      </w:r>
-      <w:r>
-        <w:rPr>
-          <w:rStyle w:val="NormalTok"/>
-        </w:rPr>
-        <w:t xml:space="preserve"> </w:t>
-      </w:r>
-      <w:r>
-        <w:rPr>
-          <w:rStyle w:val="AttributeTok"/>
-        </w:rPr>
-        <w:t xml:space="preserve">-Wsign-conversion</w:t>
-      </w:r>
-      <w:r>
-        <w:rPr>
-          <w:rStyle w:val="NormalTok"/>
-        </w:rPr>
-        <w:t xml:space="preserve"> </w:t>
-      </w:r>
-      <w:r>
-        <w:rPr>
-          <w:rStyle w:val="AttributeTok"/>
-        </w:rPr>
-        <w:t xml:space="preserve">-Wimplicit-fallthrough</w:t>
-      </w:r>
-      <w:r>
-        <w:rPr>
-          <w:rStyle w:val="NormalTok"/>
-        </w:rPr>
-        <w:t xml:space="preserve"> </w:t>
-      </w:r>
-      <w:r>
-        <w:rPr>
-          <w:rStyle w:val="AttributeTok"/>
-        </w:rPr>
-        <w:t xml:space="preserve">-fstack-protector-strong</w:t>
-      </w:r>
-      <w:r>
-        <w:rPr>
-          <w:rStyle w:val="NormalTok"/>
-        </w:rPr>
-        <w:t xml:space="preserve"> </w:t>
-      </w:r>
-      <w:r>
-        <w:rPr>
-          <w:rStyle w:val="AttributeTok"/>
-        </w:rPr>
-        <w:t xml:space="preserve">-Werror</w:t>
+        <w:t xml:space="preserve">address </w:t>
+      </w:r>
+      <w:r>
+        <w:rPr>
+          <w:rStyle w:val="AttributeTok"/>
+        </w:rPr>
+        <w:t xml:space="preserve">-c</w:t>
+      </w:r>
+      <w:r>
+        <w:rPr>
+          <w:rStyle w:val="NormalTok"/>
+        </w:rPr>
+        <w:t xml:space="preserve"> tests/lab-test.c </w:t>
+      </w:r>
+      <w:r>
+        <w:rPr>
+          <w:rStyle w:val="AttributeTok"/>
+        </w:rPr>
+        <w:t xml:space="preserve">-o</w:t>
+      </w:r>
+      <w:r>
+        <w:rPr>
+          <w:rStyle w:val="NormalTok"/>
+        </w:rPr>
+        <w:t xml:space="preserve"> build/debug-test/lab-test.c.o</w:t>
+      </w:r>
+      <w:r>
+        <w:br/>
+      </w:r>
+      <w:r>
+        <w:rPr>
+          <w:rStyle w:val="FunctionTok"/>
+        </w:rPr>
+        <w:t xml:space="preserve">cc</w:t>
+      </w:r>
+      <w:r>
+        <w:rPr>
+          <w:rStyle w:val="NormalTok"/>
+        </w:rPr>
+        <w:t xml:space="preserve"> </w:t>
+      </w:r>
+      <w:r>
+        <w:rPr>
+          <w:rStyle w:val="AttributeTok"/>
+        </w:rPr>
+        <w:t xml:space="preserve">-g</w:t>
+      </w:r>
+      <w:r>
+        <w:rPr>
+          <w:rStyle w:val="NormalTok"/>
+        </w:rPr>
+        <w:t xml:space="preserve"> </w:t>
+      </w:r>
+      <w:r>
+        <w:rPr>
+          <w:rStyle w:val="AttributeTok"/>
+        </w:rPr>
+        <w:t xml:space="preserve">-O0</w:t>
+      </w:r>
+      <w:r>
+        <w:rPr>
+          <w:rStyle w:val="NormalTok"/>
+        </w:rPr>
+        <w:t xml:space="preserve"> </w:t>
+      </w:r>
+      <w:r>
+        <w:rPr>
+          <w:rStyle w:val="AttributeTok"/>
+        </w:rPr>
+        <w:t xml:space="preserve">-DDEBUG</w:t>
+      </w:r>
+      <w:r>
+        <w:rPr>
+          <w:rStyle w:val="NormalTok"/>
+        </w:rPr>
+        <w:t xml:space="preserve"> </w:t>
+      </w:r>
+      <w:r>
+        <w:rPr>
+          <w:rStyle w:val="AttributeTok"/>
+        </w:rPr>
+        <w:t xml:space="preserve">-DTEST</w:t>
+      </w:r>
+      <w:r>
+        <w:rPr>
+          <w:rStyle w:val="NormalTok"/>
+        </w:rPr>
+        <w:t xml:space="preserve"> </w:t>
+      </w:r>
+      <w:r>
+        <w:rPr>
+          <w:rStyle w:val="AttributeTok"/>
+        </w:rPr>
+        <w:t xml:space="preserve">-fno-omit-frame-pointer</w:t>
+      </w:r>
+      <w:r>
+        <w:rPr>
+          <w:rStyle w:val="NormalTok"/>
+        </w:rPr>
+        <w:t xml:space="preserve"> </w:t>
+      </w:r>
+      <w:r>
+        <w:rPr>
+          <w:rStyle w:val="AttributeTok"/>
+        </w:rPr>
+        <w:t xml:space="preserve">-fsanitize</w:t>
       </w:r>
       <w:r>
         <w:rPr>
@@ -981,2080 +3054,7 @@
         <w:rPr>
           <w:rStyle w:val="NormalTok"/>
         </w:rPr>
-        <w:t xml:space="preserve">format-security </w:t>
-      </w:r>
-      <w:r>
-        <w:rPr>
-          <w:rStyle w:val="AttributeTok"/>
-        </w:rPr>
-        <w:t xml:space="preserve">-Werror</w:t>
-      </w:r>
-      <w:r>
-        <w:rPr>
-          <w:rStyle w:val="OperatorTok"/>
-        </w:rPr>
-        <w:t xml:space="preserve">=</w:t>
-      </w:r>
-      <w:r>
-        <w:rPr>
-          <w:rStyle w:val="NormalTok"/>
-        </w:rPr>
-        <w:t xml:space="preserve">implicit </w:t>
-      </w:r>
-      <w:r>
-        <w:rPr>
-          <w:rStyle w:val="AttributeTok"/>
-        </w:rPr>
-        <w:t xml:space="preserve">-Werror</w:t>
-      </w:r>
-      <w:r>
-        <w:rPr>
-          <w:rStyle w:val="OperatorTok"/>
-        </w:rPr>
-        <w:t xml:space="preserve">=</w:t>
-      </w:r>
-      <w:r>
-        <w:rPr>
-          <w:rStyle w:val="NormalTok"/>
-        </w:rPr>
-        <w:t xml:space="preserve">incompatible-pointer-types </w:t>
-      </w:r>
-      <w:r>
-        <w:rPr>
-          <w:rStyle w:val="AttributeTok"/>
-        </w:rPr>
-        <w:t xml:space="preserve">-Werror</w:t>
-      </w:r>
-      <w:r>
-        <w:rPr>
-          <w:rStyle w:val="OperatorTok"/>
-        </w:rPr>
-        <w:t xml:space="preserve">=</w:t>
-      </w:r>
-      <w:r>
-        <w:rPr>
-          <w:rStyle w:val="NormalTok"/>
-        </w:rPr>
-        <w:t xml:space="preserve">int-conversion </w:t>
-      </w:r>
-      <w:r>
-        <w:rPr>
-          <w:rStyle w:val="AttributeTok"/>
-        </w:rPr>
-        <w:t xml:space="preserve">-c</w:t>
-      </w:r>
-      <w:r>
-        <w:rPr>
-          <w:rStyle w:val="NormalTok"/>
-        </w:rPr>
-        <w:t xml:space="preserve"> src/main.c </w:t>
-      </w:r>
-      <w:r>
-        <w:rPr>
-          <w:rStyle w:val="AttributeTok"/>
-        </w:rPr>
-        <w:t xml:space="preserve">-o</w:t>
-      </w:r>
-      <w:r>
-        <w:rPr>
-          <w:rStyle w:val="NormalTok"/>
-        </w:rPr>
-        <w:t xml:space="preserve"> build/release/main.c.o</w:t>
-      </w:r>
-      <w:r>
-        <w:br/>
-      </w:r>
-      <w:r>
-        <w:rPr>
-          <w:rStyle w:val="FunctionTok"/>
-        </w:rPr>
-        <w:t xml:space="preserve">mkdir</w:t>
-      </w:r>
-      <w:r>
-        <w:rPr>
-          <w:rStyle w:val="NormalTok"/>
-        </w:rPr>
-        <w:t xml:space="preserve"> </w:t>
-      </w:r>
-      <w:r>
-        <w:rPr>
-          <w:rStyle w:val="AttributeTok"/>
-        </w:rPr>
-        <w:t xml:space="preserve">-p</w:t>
-      </w:r>
-      <w:r>
-        <w:rPr>
-          <w:rStyle w:val="NormalTok"/>
-        </w:rPr>
-        <w:t xml:space="preserve"> build/release</w:t>
-      </w:r>
-      <w:r>
-        <w:br/>
-      </w:r>
-      <w:r>
-        <w:rPr>
-          <w:rStyle w:val="FunctionTok"/>
-        </w:rPr>
-        <w:t xml:space="preserve">cc</w:t>
-      </w:r>
-      <w:r>
-        <w:rPr>
-          <w:rStyle w:val="NormalTok"/>
-        </w:rPr>
-        <w:t xml:space="preserve"> </w:t>
-      </w:r>
-      <w:r>
-        <w:rPr>
-          <w:rStyle w:val="AttributeTok"/>
-        </w:rPr>
-        <w:t xml:space="preserve">-Wall</w:t>
-      </w:r>
-      <w:r>
-        <w:rPr>
-          <w:rStyle w:val="NormalTok"/>
-        </w:rPr>
-        <w:t xml:space="preserve"> </w:t>
-      </w:r>
-      <w:r>
-        <w:rPr>
-          <w:rStyle w:val="AttributeTok"/>
-        </w:rPr>
-        <w:t xml:space="preserve">-Wextra</w:t>
-      </w:r>
-      <w:r>
-        <w:rPr>
-          <w:rStyle w:val="NormalTok"/>
-        </w:rPr>
-        <w:t xml:space="preserve"> </w:t>
-      </w:r>
-      <w:r>
-        <w:rPr>
-          <w:rStyle w:val="AttributeTok"/>
-        </w:rPr>
-        <w:t xml:space="preserve">-O2</w:t>
-      </w:r>
-      <w:r>
-        <w:rPr>
-          <w:rStyle w:val="NormalTok"/>
-        </w:rPr>
-        <w:t xml:space="preserve"> </w:t>
-      </w:r>
-      <w:r>
-        <w:rPr>
-          <w:rStyle w:val="AttributeTok"/>
-        </w:rPr>
-        <w:t xml:space="preserve">-fPIE</w:t>
-      </w:r>
-      <w:r>
-        <w:rPr>
-          <w:rStyle w:val="NormalTok"/>
-        </w:rPr>
-        <w:t xml:space="preserve"> </w:t>
-      </w:r>
-      <w:r>
-        <w:rPr>
-          <w:rStyle w:val="AttributeTok"/>
-        </w:rPr>
-        <w:t xml:space="preserve">-MMD</w:t>
-      </w:r>
-      <w:r>
-        <w:rPr>
-          <w:rStyle w:val="NormalTok"/>
-        </w:rPr>
-        <w:t xml:space="preserve"> </w:t>
-      </w:r>
-      <w:r>
-        <w:rPr>
-          <w:rStyle w:val="AttributeTok"/>
-        </w:rPr>
-        <w:t xml:space="preserve">-MP</w:t>
-      </w:r>
-      <w:r>
-        <w:rPr>
-          <w:rStyle w:val="NormalTok"/>
-        </w:rPr>
-        <w:t xml:space="preserve"> </w:t>
-      </w:r>
-      <w:r>
-        <w:rPr>
-          <w:rStyle w:val="AttributeTok"/>
-        </w:rPr>
-        <w:t xml:space="preserve">-Wformat</w:t>
-      </w:r>
-      <w:r>
-        <w:rPr>
-          <w:rStyle w:val="NormalTok"/>
-        </w:rPr>
-        <w:t xml:space="preserve"> </w:t>
-      </w:r>
-      <w:r>
-        <w:rPr>
-          <w:rStyle w:val="AttributeTok"/>
-        </w:rPr>
-        <w:t xml:space="preserve">-Wformat</w:t>
-      </w:r>
-      <w:r>
-        <w:rPr>
-          <w:rStyle w:val="OperatorTok"/>
-        </w:rPr>
-        <w:t xml:space="preserve">=</w:t>
-      </w:r>
-      <w:r>
-        <w:rPr>
-          <w:rStyle w:val="NormalTok"/>
-        </w:rPr>
-        <w:t xml:space="preserve">2 </w:t>
-      </w:r>
-      <w:r>
-        <w:rPr>
-          <w:rStyle w:val="AttributeTok"/>
-        </w:rPr>
-        <w:t xml:space="preserve">-Wconversion</w:t>
-      </w:r>
-      <w:r>
-        <w:rPr>
-          <w:rStyle w:val="NormalTok"/>
-        </w:rPr>
-        <w:t xml:space="preserve"> </w:t>
-      </w:r>
-      <w:r>
-        <w:rPr>
-          <w:rStyle w:val="AttributeTok"/>
-        </w:rPr>
-        <w:t xml:space="preserve">-Wsign-conversion</w:t>
-      </w:r>
-      <w:r>
-        <w:rPr>
-          <w:rStyle w:val="NormalTok"/>
-        </w:rPr>
-        <w:t xml:space="preserve"> </w:t>
-      </w:r>
-      <w:r>
-        <w:rPr>
-          <w:rStyle w:val="AttributeTok"/>
-        </w:rPr>
-        <w:t xml:space="preserve">-Wimplicit-fallthrough</w:t>
-      </w:r>
-      <w:r>
-        <w:rPr>
-          <w:rStyle w:val="NormalTok"/>
-        </w:rPr>
-        <w:t xml:space="preserve"> </w:t>
-      </w:r>
-      <w:r>
-        <w:rPr>
-          <w:rStyle w:val="AttributeTok"/>
-        </w:rPr>
-        <w:t xml:space="preserve">-fstack-protector-strong</w:t>
-      </w:r>
-      <w:r>
-        <w:rPr>
-          <w:rStyle w:val="NormalTok"/>
-        </w:rPr>
-        <w:t xml:space="preserve"> </w:t>
-      </w:r>
-      <w:r>
-        <w:rPr>
-          <w:rStyle w:val="AttributeTok"/>
-        </w:rPr>
-        <w:t xml:space="preserve">-Werror</w:t>
-      </w:r>
-      <w:r>
-        <w:rPr>
-          <w:rStyle w:val="OperatorTok"/>
-        </w:rPr>
-        <w:t xml:space="preserve">=</w:t>
-      </w:r>
-      <w:r>
-        <w:rPr>
-          <w:rStyle w:val="NormalTok"/>
-        </w:rPr>
-        <w:t xml:space="preserve">format-security </w:t>
-      </w:r>
-      <w:r>
-        <w:rPr>
-          <w:rStyle w:val="AttributeTok"/>
-        </w:rPr>
-        <w:t xml:space="preserve">-Werror</w:t>
-      </w:r>
-      <w:r>
-        <w:rPr>
-          <w:rStyle w:val="OperatorTok"/>
-        </w:rPr>
-        <w:t xml:space="preserve">=</w:t>
-      </w:r>
-      <w:r>
-        <w:rPr>
-          <w:rStyle w:val="NormalTok"/>
-        </w:rPr>
-        <w:t xml:space="preserve">implicit </w:t>
-      </w:r>
-      <w:r>
-        <w:rPr>
-          <w:rStyle w:val="AttributeTok"/>
-        </w:rPr>
-        <w:t xml:space="preserve">-Werror</w:t>
-      </w:r>
-      <w:r>
-        <w:rPr>
-          <w:rStyle w:val="OperatorTok"/>
-        </w:rPr>
-        <w:t xml:space="preserve">=</w:t>
-      </w:r>
-      <w:r>
-        <w:rPr>
-          <w:rStyle w:val="NormalTok"/>
-        </w:rPr>
-        <w:t xml:space="preserve">incompatible-pointer-types </w:t>
-      </w:r>
-      <w:r>
-        <w:rPr>
-          <w:rStyle w:val="AttributeTok"/>
-        </w:rPr>
-        <w:t xml:space="preserve">-Werror</w:t>
-      </w:r>
-      <w:r>
-        <w:rPr>
-          <w:rStyle w:val="OperatorTok"/>
-        </w:rPr>
-        <w:t xml:space="preserve">=</w:t>
-      </w:r>
-      <w:r>
-        <w:rPr>
-          <w:rStyle w:val="NormalTok"/>
-        </w:rPr>
-        <w:t xml:space="preserve">int-conversion </w:t>
-      </w:r>
-      <w:r>
-        <w:rPr>
-          <w:rStyle w:val="AttributeTok"/>
-        </w:rPr>
-        <w:t xml:space="preserve">-c</w:t>
-      </w:r>
-      <w:r>
-        <w:rPr>
-          <w:rStyle w:val="NormalTok"/>
-        </w:rPr>
-        <w:t xml:space="preserve"> src/lab.c </w:t>
-      </w:r>
-      <w:r>
-        <w:rPr>
-          <w:rStyle w:val="AttributeTok"/>
-        </w:rPr>
-        <w:t xml:space="preserve">-o</w:t>
-      </w:r>
-      <w:r>
-        <w:rPr>
-          <w:rStyle w:val="NormalTok"/>
-        </w:rPr>
-        <w:t xml:space="preserve"> build/release/lab.c.o</w:t>
-      </w:r>
-      <w:r>
-        <w:br/>
-      </w:r>
-      <w:r>
-        <w:rPr>
-          <w:rStyle w:val="FunctionTok"/>
-        </w:rPr>
-        <w:t xml:space="preserve">cc</w:t>
-      </w:r>
-      <w:r>
-        <w:rPr>
-          <w:rStyle w:val="NormalTok"/>
-        </w:rPr>
-        <w:t xml:space="preserve"> </w:t>
-      </w:r>
-      <w:r>
-        <w:rPr>
-          <w:rStyle w:val="AttributeTok"/>
-        </w:rPr>
-        <w:t xml:space="preserve">-Wall</w:t>
-      </w:r>
-      <w:r>
-        <w:rPr>
-          <w:rStyle w:val="NormalTok"/>
-        </w:rPr>
-        <w:t xml:space="preserve"> </w:t>
-      </w:r>
-      <w:r>
-        <w:rPr>
-          <w:rStyle w:val="AttributeTok"/>
-        </w:rPr>
-        <w:t xml:space="preserve">-Wextra</w:t>
-      </w:r>
-      <w:r>
-        <w:rPr>
-          <w:rStyle w:val="NormalTok"/>
-        </w:rPr>
-        <w:t xml:space="preserve"> </w:t>
-      </w:r>
-      <w:r>
-        <w:rPr>
-          <w:rStyle w:val="AttributeTok"/>
-        </w:rPr>
-        <w:t xml:space="preserve">-O2</w:t>
-      </w:r>
-      <w:r>
-        <w:rPr>
-          <w:rStyle w:val="NormalTok"/>
-        </w:rPr>
-        <w:t xml:space="preserve"> </w:t>
-      </w:r>
-      <w:r>
-        <w:rPr>
-          <w:rStyle w:val="AttributeTok"/>
-        </w:rPr>
-        <w:t xml:space="preserve">-fPIE</w:t>
-      </w:r>
-      <w:r>
-        <w:rPr>
-          <w:rStyle w:val="NormalTok"/>
-        </w:rPr>
-        <w:t xml:space="preserve"> </w:t>
-      </w:r>
-      <w:r>
-        <w:rPr>
-          <w:rStyle w:val="AttributeTok"/>
-        </w:rPr>
-        <w:t xml:space="preserve">-MMD</w:t>
-      </w:r>
-      <w:r>
-        <w:rPr>
-          <w:rStyle w:val="NormalTok"/>
-        </w:rPr>
-        <w:t xml:space="preserve"> </w:t>
-      </w:r>
-      <w:r>
-        <w:rPr>
-          <w:rStyle w:val="AttributeTok"/>
-        </w:rPr>
-        <w:t xml:space="preserve">-MP</w:t>
-      </w:r>
-      <w:r>
-        <w:rPr>
-          <w:rStyle w:val="NormalTok"/>
-        </w:rPr>
-        <w:t xml:space="preserve"> </w:t>
-      </w:r>
-      <w:r>
-        <w:rPr>
-          <w:rStyle w:val="AttributeTok"/>
-        </w:rPr>
-        <w:t xml:space="preserve">-Wformat</w:t>
-      </w:r>
-      <w:r>
-        <w:rPr>
-          <w:rStyle w:val="NormalTok"/>
-        </w:rPr>
-        <w:t xml:space="preserve"> </w:t>
-      </w:r>
-      <w:r>
-        <w:rPr>
-          <w:rStyle w:val="AttributeTok"/>
-        </w:rPr>
-        <w:t xml:space="preserve">-Wformat</w:t>
-      </w:r>
-      <w:r>
-        <w:rPr>
-          <w:rStyle w:val="OperatorTok"/>
-        </w:rPr>
-        <w:t xml:space="preserve">=</w:t>
-      </w:r>
-      <w:r>
-        <w:rPr>
-          <w:rStyle w:val="NormalTok"/>
-        </w:rPr>
-        <w:t xml:space="preserve">2 </w:t>
-      </w:r>
-      <w:r>
-        <w:rPr>
-          <w:rStyle w:val="AttributeTok"/>
-        </w:rPr>
-        <w:t xml:space="preserve">-Wconversion</w:t>
-      </w:r>
-      <w:r>
-        <w:rPr>
-          <w:rStyle w:val="NormalTok"/>
-        </w:rPr>
-        <w:t xml:space="preserve"> </w:t>
-      </w:r>
-      <w:r>
-        <w:rPr>
-          <w:rStyle w:val="AttributeTok"/>
-        </w:rPr>
-        <w:t xml:space="preserve">-Wsign-conversion</w:t>
-      </w:r>
-      <w:r>
-        <w:rPr>
-          <w:rStyle w:val="NormalTok"/>
-        </w:rPr>
-        <w:t xml:space="preserve"> </w:t>
-      </w:r>
-      <w:r>
-        <w:rPr>
-          <w:rStyle w:val="AttributeTok"/>
-        </w:rPr>
-        <w:t xml:space="preserve">-Wimplicit-fallthrough</w:t>
-      </w:r>
-      <w:r>
-        <w:rPr>
-          <w:rStyle w:val="NormalTok"/>
-        </w:rPr>
-        <w:t xml:space="preserve"> </w:t>
-      </w:r>
-      <w:r>
-        <w:rPr>
-          <w:rStyle w:val="AttributeTok"/>
-        </w:rPr>
-        <w:t xml:space="preserve">-fstack-protector-strong</w:t>
-      </w:r>
-      <w:r>
-        <w:rPr>
-          <w:rStyle w:val="NormalTok"/>
-        </w:rPr>
-        <w:t xml:space="preserve"> </w:t>
-      </w:r>
-      <w:r>
-        <w:rPr>
-          <w:rStyle w:val="AttributeTok"/>
-        </w:rPr>
-        <w:t xml:space="preserve">-Werror</w:t>
-      </w:r>
-      <w:r>
-        <w:rPr>
-          <w:rStyle w:val="OperatorTok"/>
-        </w:rPr>
-        <w:t xml:space="preserve">=</w:t>
-      </w:r>
-      <w:r>
-        <w:rPr>
-          <w:rStyle w:val="NormalTok"/>
-        </w:rPr>
-        <w:t xml:space="preserve">format-security </w:t>
-      </w:r>
-      <w:r>
-        <w:rPr>
-          <w:rStyle w:val="AttributeTok"/>
-        </w:rPr>
-        <w:t xml:space="preserve">-Werror</w:t>
-      </w:r>
-      <w:r>
-        <w:rPr>
-          <w:rStyle w:val="OperatorTok"/>
-        </w:rPr>
-        <w:t xml:space="preserve">=</w:t>
-      </w:r>
-      <w:r>
-        <w:rPr>
-          <w:rStyle w:val="NormalTok"/>
-        </w:rPr>
-        <w:t xml:space="preserve">implicit </w:t>
-      </w:r>
-      <w:r>
-        <w:rPr>
-          <w:rStyle w:val="AttributeTok"/>
-        </w:rPr>
-        <w:t xml:space="preserve">-Werror</w:t>
-      </w:r>
-      <w:r>
-        <w:rPr>
-          <w:rStyle w:val="OperatorTok"/>
-        </w:rPr>
-        <w:t xml:space="preserve">=</w:t>
-      </w:r>
-      <w:r>
-        <w:rPr>
-          <w:rStyle w:val="NormalTok"/>
-        </w:rPr>
-        <w:t xml:space="preserve">incompatible-pointer-types </w:t>
-      </w:r>
-      <w:r>
-        <w:rPr>
-          <w:rStyle w:val="AttributeTok"/>
-        </w:rPr>
-        <w:t xml:space="preserve">-Werror</w:t>
-      </w:r>
-      <w:r>
-        <w:rPr>
-          <w:rStyle w:val="OperatorTok"/>
-        </w:rPr>
-        <w:t xml:space="preserve">=</w:t>
-      </w:r>
-      <w:r>
-        <w:rPr>
-          <w:rStyle w:val="NormalTok"/>
-        </w:rPr>
-        <w:t xml:space="preserve">int-conversion build/release/main.c.o build/release/lab.c.o </w:t>
-      </w:r>
-      <w:r>
-        <w:rPr>
-          <w:rStyle w:val="AttributeTok"/>
-        </w:rPr>
-        <w:t xml:space="preserve">-o</w:t>
-      </w:r>
-      <w:r>
-        <w:rPr>
-          <w:rStyle w:val="NormalTok"/>
-        </w:rPr>
-        <w:t xml:space="preserve"> build/release/myapp </w:t>
-      </w:r>
-      <w:r>
-        <w:br/>
-      </w:r>
-      <w:r>
-        <w:rPr>
-          <w:rStyle w:val="VariableTok"/>
-        </w:rPr>
-        <w:t xml:space="preserve">make</w:t>
-      </w:r>
-      <w:r>
-        <w:rPr>
-          <w:rStyle w:val="OperatorTok"/>
-        </w:rPr>
-        <w:t xml:space="preserve">[</w:t>
-      </w:r>
-      <w:r>
-        <w:rPr>
-          <w:rStyle w:val="DecValTok"/>
-        </w:rPr>
-        <w:t xml:space="preserve">1</w:t>
-      </w:r>
-      <w:r>
-        <w:rPr>
-          <w:rStyle w:val="OperatorTok"/>
-        </w:rPr>
-        <w:t xml:space="preserve">]</w:t>
-      </w:r>
-      <w:r>
-        <w:rPr>
-          <w:rStyle w:val="ExtensionTok"/>
-        </w:rPr>
-        <w:t xml:space="preserve">:</w:t>
-      </w:r>
-      <w:r>
-        <w:rPr>
-          <w:rStyle w:val="NormalTok"/>
-        </w:rPr>
-        <w:t xml:space="preserve"> Leaving directory </w:t>
-      </w:r>
-      <w:r>
-        <w:rPr>
-          <w:rStyle w:val="StringTok"/>
-        </w:rPr>
-        <w:t xml:space="preserve">'/home/PERRYARYEE/Computer-Networks-CS525'</w:t>
-      </w:r>
-      <w:r>
-        <w:br/>
-      </w:r>
-      <w:r>
-        <w:rPr>
-          <w:rStyle w:val="VariableTok"/>
-        </w:rPr>
-        <w:t xml:space="preserve">make</w:t>
-      </w:r>
-      <w:r>
-        <w:rPr>
-          <w:rStyle w:val="OperatorTok"/>
-        </w:rPr>
-        <w:t xml:space="preserve">[</w:t>
-      </w:r>
-      <w:r>
-        <w:rPr>
-          <w:rStyle w:val="DecValTok"/>
-        </w:rPr>
-        <w:t xml:space="preserve">1</w:t>
-      </w:r>
-      <w:r>
-        <w:rPr>
-          <w:rStyle w:val="OperatorTok"/>
-        </w:rPr>
-        <w:t xml:space="preserve">]</w:t>
-      </w:r>
-      <w:r>
-        <w:rPr>
-          <w:rStyle w:val="ExtensionTok"/>
-        </w:rPr>
-        <w:t xml:space="preserve">:</w:t>
-      </w:r>
-      <w:r>
-        <w:rPr>
-          <w:rStyle w:val="NormalTok"/>
-        </w:rPr>
-        <w:t xml:space="preserve"> Entering directory </w:t>
-      </w:r>
-      <w:r>
-        <w:rPr>
-          <w:rStyle w:val="StringTok"/>
-        </w:rPr>
-        <w:t xml:space="preserve">'/home/PERRYARYEE/Computer-Networks-CS525'</w:t>
-      </w:r>
-      <w:r>
-        <w:br/>
-      </w:r>
-      <w:r>
-        <w:rPr>
-          <w:rStyle w:val="FunctionTok"/>
-        </w:rPr>
-        <w:t xml:space="preserve">mkdir</w:t>
-      </w:r>
-      <w:r>
-        <w:rPr>
-          <w:rStyle w:val="NormalTok"/>
-        </w:rPr>
-        <w:t xml:space="preserve"> </w:t>
-      </w:r>
-      <w:r>
-        <w:rPr>
-          <w:rStyle w:val="AttributeTok"/>
-        </w:rPr>
-        <w:t xml:space="preserve">-p</w:t>
-      </w:r>
-      <w:r>
-        <w:rPr>
-          <w:rStyle w:val="NormalTok"/>
-        </w:rPr>
-        <w:t xml:space="preserve"> build/tests</w:t>
-      </w:r>
-      <w:r>
-        <w:br/>
-      </w:r>
-      <w:r>
-        <w:rPr>
-          <w:rStyle w:val="FunctionTok"/>
-        </w:rPr>
-        <w:t xml:space="preserve">cc</w:t>
-      </w:r>
-      <w:r>
-        <w:rPr>
-          <w:rStyle w:val="NormalTok"/>
-        </w:rPr>
-        <w:t xml:space="preserve"> </w:t>
-      </w:r>
-      <w:r>
-        <w:rPr>
-          <w:rStyle w:val="AttributeTok"/>
-        </w:rPr>
-        <w:t xml:space="preserve">-g</w:t>
-      </w:r>
-      <w:r>
-        <w:rPr>
-          <w:rStyle w:val="NormalTok"/>
-        </w:rPr>
-        <w:t xml:space="preserve"> </w:t>
-      </w:r>
-      <w:r>
-        <w:rPr>
-          <w:rStyle w:val="AttributeTok"/>
-        </w:rPr>
-        <w:t xml:space="preserve">-O0</w:t>
-      </w:r>
-      <w:r>
-        <w:rPr>
-          <w:rStyle w:val="NormalTok"/>
-        </w:rPr>
-        <w:t xml:space="preserve"> </w:t>
-      </w:r>
-      <w:r>
-        <w:rPr>
-          <w:rStyle w:val="AttributeTok"/>
-        </w:rPr>
-        <w:t xml:space="preserve">-DTEST</w:t>
-      </w:r>
-      <w:r>
-        <w:rPr>
-          <w:rStyle w:val="NormalTok"/>
-        </w:rPr>
-        <w:t xml:space="preserve"> </w:t>
-      </w:r>
-      <w:r>
-        <w:rPr>
-          <w:rStyle w:val="AttributeTok"/>
-        </w:rPr>
-        <w:t xml:space="preserve">-fprofile-arcs</w:t>
-      </w:r>
-      <w:r>
-        <w:rPr>
-          <w:rStyle w:val="NormalTok"/>
-        </w:rPr>
-        <w:t xml:space="preserve"> </w:t>
-      </w:r>
-      <w:r>
-        <w:rPr>
-          <w:rStyle w:val="AttributeTok"/>
-        </w:rPr>
-        <w:t xml:space="preserve">-ftest-coverage</w:t>
-      </w:r>
-      <w:r>
-        <w:rPr>
-          <w:rStyle w:val="NormalTok"/>
-        </w:rPr>
-        <w:t xml:space="preserve"> </w:t>
-      </w:r>
-      <w:r>
-        <w:rPr>
-          <w:rStyle w:val="AttributeTok"/>
-        </w:rPr>
-        <w:t xml:space="preserve">-c</w:t>
-      </w:r>
-      <w:r>
-        <w:rPr>
-          <w:rStyle w:val="NormalTok"/>
-        </w:rPr>
-        <w:t xml:space="preserve"> src/main.c </w:t>
-      </w:r>
-      <w:r>
-        <w:rPr>
-          <w:rStyle w:val="AttributeTok"/>
-        </w:rPr>
-        <w:t xml:space="preserve">-o</w:t>
-      </w:r>
-      <w:r>
-        <w:rPr>
-          <w:rStyle w:val="NormalTok"/>
-        </w:rPr>
-        <w:t xml:space="preserve"> build/tests/main.c.o</w:t>
-      </w:r>
-      <w:r>
-        <w:br/>
-      </w:r>
-      <w:r>
-        <w:rPr>
-          <w:rStyle w:val="FunctionTok"/>
-        </w:rPr>
-        <w:t xml:space="preserve">mkdir</w:t>
-      </w:r>
-      <w:r>
-        <w:rPr>
-          <w:rStyle w:val="NormalTok"/>
-        </w:rPr>
-        <w:t xml:space="preserve"> </w:t>
-      </w:r>
-      <w:r>
-        <w:rPr>
-          <w:rStyle w:val="AttributeTok"/>
-        </w:rPr>
-        <w:t xml:space="preserve">-p</w:t>
-      </w:r>
-      <w:r>
-        <w:rPr>
-          <w:rStyle w:val="NormalTok"/>
-        </w:rPr>
-        <w:t xml:space="preserve"> build/tests</w:t>
-      </w:r>
-      <w:r>
-        <w:br/>
-      </w:r>
-      <w:r>
-        <w:rPr>
-          <w:rStyle w:val="FunctionTok"/>
-        </w:rPr>
-        <w:t xml:space="preserve">cc</w:t>
-      </w:r>
-      <w:r>
-        <w:rPr>
-          <w:rStyle w:val="NormalTok"/>
-        </w:rPr>
-        <w:t xml:space="preserve"> </w:t>
-      </w:r>
-      <w:r>
-        <w:rPr>
-          <w:rStyle w:val="AttributeTok"/>
-        </w:rPr>
-        <w:t xml:space="preserve">-g</w:t>
-      </w:r>
-      <w:r>
-        <w:rPr>
-          <w:rStyle w:val="NormalTok"/>
-        </w:rPr>
-        <w:t xml:space="preserve"> </w:t>
-      </w:r>
-      <w:r>
-        <w:rPr>
-          <w:rStyle w:val="AttributeTok"/>
-        </w:rPr>
-        <w:t xml:space="preserve">-O0</w:t>
-      </w:r>
-      <w:r>
-        <w:rPr>
-          <w:rStyle w:val="NormalTok"/>
-        </w:rPr>
-        <w:t xml:space="preserve"> </w:t>
-      </w:r>
-      <w:r>
-        <w:rPr>
-          <w:rStyle w:val="AttributeTok"/>
-        </w:rPr>
-        <w:t xml:space="preserve">-DTEST</w:t>
-      </w:r>
-      <w:r>
-        <w:rPr>
-          <w:rStyle w:val="NormalTok"/>
-        </w:rPr>
-        <w:t xml:space="preserve"> </w:t>
-      </w:r>
-      <w:r>
-        <w:rPr>
-          <w:rStyle w:val="AttributeTok"/>
-        </w:rPr>
-        <w:t xml:space="preserve">-fprofile-arcs</w:t>
-      </w:r>
-      <w:r>
-        <w:rPr>
-          <w:rStyle w:val="NormalTok"/>
-        </w:rPr>
-        <w:t xml:space="preserve"> </w:t>
-      </w:r>
-      <w:r>
-        <w:rPr>
-          <w:rStyle w:val="AttributeTok"/>
-        </w:rPr>
-        <w:t xml:space="preserve">-ftest-coverage</w:t>
-      </w:r>
-      <w:r>
-        <w:rPr>
-          <w:rStyle w:val="NormalTok"/>
-        </w:rPr>
-        <w:t xml:space="preserve"> </w:t>
-      </w:r>
-      <w:r>
-        <w:rPr>
-          <w:rStyle w:val="AttributeTok"/>
-        </w:rPr>
-        <w:t xml:space="preserve">-c</w:t>
-      </w:r>
-      <w:r>
-        <w:rPr>
-          <w:rStyle w:val="NormalTok"/>
-        </w:rPr>
-        <w:t xml:space="preserve"> src/lab.c </w:t>
-      </w:r>
-      <w:r>
-        <w:rPr>
-          <w:rStyle w:val="AttributeTok"/>
-        </w:rPr>
-        <w:t xml:space="preserve">-o</w:t>
-      </w:r>
-      <w:r>
-        <w:rPr>
-          <w:rStyle w:val="NormalTok"/>
-        </w:rPr>
-        <w:t xml:space="preserve"> build/tests/lab.c.o</w:t>
-      </w:r>
-      <w:r>
-        <w:br/>
-      </w:r>
-      <w:r>
-        <w:rPr>
-          <w:rStyle w:val="FunctionTok"/>
-        </w:rPr>
-        <w:t xml:space="preserve">mkdir</w:t>
-      </w:r>
-      <w:r>
-        <w:rPr>
-          <w:rStyle w:val="NormalTok"/>
-        </w:rPr>
-        <w:t xml:space="preserve"> </w:t>
-      </w:r>
-      <w:r>
-        <w:rPr>
-          <w:rStyle w:val="AttributeTok"/>
-        </w:rPr>
-        <w:t xml:space="preserve">-p</w:t>
-      </w:r>
-      <w:r>
-        <w:rPr>
-          <w:rStyle w:val="NormalTok"/>
-        </w:rPr>
-        <w:t xml:space="preserve"> build/tests/harness/</w:t>
-      </w:r>
-      <w:r>
-        <w:br/>
-      </w:r>
-      <w:r>
-        <w:rPr>
-          <w:rStyle w:val="FunctionTok"/>
-        </w:rPr>
-        <w:t xml:space="preserve">cc</w:t>
-      </w:r>
-      <w:r>
-        <w:rPr>
-          <w:rStyle w:val="NormalTok"/>
-        </w:rPr>
-        <w:t xml:space="preserve"> </w:t>
-      </w:r>
-      <w:r>
-        <w:rPr>
-          <w:rStyle w:val="AttributeTok"/>
-        </w:rPr>
-        <w:t xml:space="preserve">-g</w:t>
-      </w:r>
-      <w:r>
-        <w:rPr>
-          <w:rStyle w:val="NormalTok"/>
-        </w:rPr>
-        <w:t xml:space="preserve"> </w:t>
-      </w:r>
-      <w:r>
-        <w:rPr>
-          <w:rStyle w:val="AttributeTok"/>
-        </w:rPr>
-        <w:t xml:space="preserve">-O0</w:t>
-      </w:r>
-      <w:r>
-        <w:rPr>
-          <w:rStyle w:val="NormalTok"/>
-        </w:rPr>
-        <w:t xml:space="preserve"> </w:t>
-      </w:r>
-      <w:r>
-        <w:rPr>
-          <w:rStyle w:val="AttributeTok"/>
-        </w:rPr>
-        <w:t xml:space="preserve">-DTEST</w:t>
-      </w:r>
-      <w:r>
-        <w:rPr>
-          <w:rStyle w:val="NormalTok"/>
-        </w:rPr>
-        <w:t xml:space="preserve"> </w:t>
-      </w:r>
-      <w:r>
-        <w:rPr>
-          <w:rStyle w:val="AttributeTok"/>
-        </w:rPr>
-        <w:t xml:space="preserve">-fprofile-arcs</w:t>
-      </w:r>
-      <w:r>
-        <w:rPr>
-          <w:rStyle w:val="NormalTok"/>
-        </w:rPr>
-        <w:t xml:space="preserve"> </w:t>
-      </w:r>
-      <w:r>
-        <w:rPr>
-          <w:rStyle w:val="AttributeTok"/>
-        </w:rPr>
-        <w:t xml:space="preserve">-ftest-coverage</w:t>
-      </w:r>
-      <w:r>
-        <w:rPr>
-          <w:rStyle w:val="NormalTok"/>
-        </w:rPr>
-        <w:t xml:space="preserve"> </w:t>
-      </w:r>
-      <w:r>
-        <w:rPr>
-          <w:rStyle w:val="AttributeTok"/>
-        </w:rPr>
-        <w:t xml:space="preserve">-c</w:t>
-      </w:r>
-      <w:r>
-        <w:rPr>
-          <w:rStyle w:val="NormalTok"/>
-        </w:rPr>
-        <w:t xml:space="preserve"> tests/harness/unity.c </w:t>
-      </w:r>
-      <w:r>
-        <w:rPr>
-          <w:rStyle w:val="AttributeTok"/>
-        </w:rPr>
-        <w:t xml:space="preserve">-o</w:t>
-      </w:r>
-      <w:r>
-        <w:rPr>
-          <w:rStyle w:val="NormalTok"/>
-        </w:rPr>
-        <w:t xml:space="preserve"> build/tests/harness/unity.c.o</w:t>
-      </w:r>
-      <w:r>
-        <w:br/>
-      </w:r>
-      <w:r>
-        <w:rPr>
-          <w:rStyle w:val="FunctionTok"/>
-        </w:rPr>
-        <w:t xml:space="preserve">mkdir</w:t>
-      </w:r>
-      <w:r>
-        <w:rPr>
-          <w:rStyle w:val="NormalTok"/>
-        </w:rPr>
-        <w:t xml:space="preserve"> </w:t>
-      </w:r>
-      <w:r>
-        <w:rPr>
-          <w:rStyle w:val="AttributeTok"/>
-        </w:rPr>
-        <w:t xml:space="preserve">-p</w:t>
-      </w:r>
-      <w:r>
-        <w:rPr>
-          <w:rStyle w:val="NormalTok"/>
-        </w:rPr>
-        <w:t xml:space="preserve"> build/tests/</w:t>
-      </w:r>
-      <w:r>
-        <w:br/>
-      </w:r>
-      <w:r>
-        <w:rPr>
-          <w:rStyle w:val="FunctionTok"/>
-        </w:rPr>
-        <w:t xml:space="preserve">cc</w:t>
-      </w:r>
-      <w:r>
-        <w:rPr>
-          <w:rStyle w:val="NormalTok"/>
-        </w:rPr>
-        <w:t xml:space="preserve"> </w:t>
-      </w:r>
-      <w:r>
-        <w:rPr>
-          <w:rStyle w:val="AttributeTok"/>
-        </w:rPr>
-        <w:t xml:space="preserve">-g</w:t>
-      </w:r>
-      <w:r>
-        <w:rPr>
-          <w:rStyle w:val="NormalTok"/>
-        </w:rPr>
-        <w:t xml:space="preserve"> </w:t>
-      </w:r>
-      <w:r>
-        <w:rPr>
-          <w:rStyle w:val="AttributeTok"/>
-        </w:rPr>
-        <w:t xml:space="preserve">-O0</w:t>
-      </w:r>
-      <w:r>
-        <w:rPr>
-          <w:rStyle w:val="NormalTok"/>
-        </w:rPr>
-        <w:t xml:space="preserve"> </w:t>
-      </w:r>
-      <w:r>
-        <w:rPr>
-          <w:rStyle w:val="AttributeTok"/>
-        </w:rPr>
-        <w:t xml:space="preserve">-DTEST</w:t>
-      </w:r>
-      <w:r>
-        <w:rPr>
-          <w:rStyle w:val="NormalTok"/>
-        </w:rPr>
-        <w:t xml:space="preserve"> </w:t>
-      </w:r>
-      <w:r>
-        <w:rPr>
-          <w:rStyle w:val="AttributeTok"/>
-        </w:rPr>
-        <w:t xml:space="preserve">-fprofile-arcs</w:t>
-      </w:r>
-      <w:r>
-        <w:rPr>
-          <w:rStyle w:val="NormalTok"/>
-        </w:rPr>
-        <w:t xml:space="preserve"> </w:t>
-      </w:r>
-      <w:r>
-        <w:rPr>
-          <w:rStyle w:val="AttributeTok"/>
-        </w:rPr>
-        <w:t xml:space="preserve">-ftest-coverage</w:t>
-      </w:r>
-      <w:r>
-        <w:rPr>
-          <w:rStyle w:val="NormalTok"/>
-        </w:rPr>
-        <w:t xml:space="preserve"> </w:t>
-      </w:r>
-      <w:r>
-        <w:rPr>
-          <w:rStyle w:val="AttributeTok"/>
-        </w:rPr>
-        <w:t xml:space="preserve">-c</w:t>
-      </w:r>
-      <w:r>
-        <w:rPr>
-          <w:rStyle w:val="NormalTok"/>
-        </w:rPr>
-        <w:t xml:space="preserve"> tests/lab-test.c </w:t>
-      </w:r>
-      <w:r>
-        <w:rPr>
-          <w:rStyle w:val="AttributeTok"/>
-        </w:rPr>
-        <w:t xml:space="preserve">-o</w:t>
-      </w:r>
-      <w:r>
-        <w:rPr>
-          <w:rStyle w:val="NormalTok"/>
-        </w:rPr>
-        <w:t xml:space="preserve"> build/tests/lab-test.c.o</w:t>
-      </w:r>
-      <w:r>
-        <w:br/>
-      </w:r>
-      <w:r>
-        <w:rPr>
-          <w:rStyle w:val="FunctionTok"/>
-        </w:rPr>
-        <w:t xml:space="preserve">cc</w:t>
-      </w:r>
-      <w:r>
-        <w:rPr>
-          <w:rStyle w:val="NormalTok"/>
-        </w:rPr>
-        <w:t xml:space="preserve"> </w:t>
-      </w:r>
-      <w:r>
-        <w:rPr>
-          <w:rStyle w:val="AttributeTok"/>
-        </w:rPr>
-        <w:t xml:space="preserve">-g</w:t>
-      </w:r>
-      <w:r>
-        <w:rPr>
-          <w:rStyle w:val="NormalTok"/>
-        </w:rPr>
-        <w:t xml:space="preserve"> </w:t>
-      </w:r>
-      <w:r>
-        <w:rPr>
-          <w:rStyle w:val="AttributeTok"/>
-        </w:rPr>
-        <w:t xml:space="preserve">-O0</w:t>
-      </w:r>
-      <w:r>
-        <w:rPr>
-          <w:rStyle w:val="NormalTok"/>
-        </w:rPr>
-        <w:t xml:space="preserve"> </w:t>
-      </w:r>
-      <w:r>
-        <w:rPr>
-          <w:rStyle w:val="AttributeTok"/>
-        </w:rPr>
-        <w:t xml:space="preserve">-DTEST</w:t>
-      </w:r>
-      <w:r>
-        <w:rPr>
-          <w:rStyle w:val="NormalTok"/>
-        </w:rPr>
-        <w:t xml:space="preserve"> </w:t>
-      </w:r>
-      <w:r>
-        <w:rPr>
-          <w:rStyle w:val="AttributeTok"/>
-        </w:rPr>
-        <w:t xml:space="preserve">-fprofile-arcs</w:t>
-      </w:r>
-      <w:r>
-        <w:rPr>
-          <w:rStyle w:val="NormalTok"/>
-        </w:rPr>
-        <w:t xml:space="preserve"> </w:t>
-      </w:r>
-      <w:r>
-        <w:rPr>
-          <w:rStyle w:val="AttributeTok"/>
-        </w:rPr>
-        <w:t xml:space="preserve">-ftest-coverage</w:t>
-      </w:r>
-      <w:r>
-        <w:rPr>
-          <w:rStyle w:val="NormalTok"/>
-        </w:rPr>
-        <w:t xml:space="preserve"> build/tests/main.c.o build/tests/lab.c.o build/tests/harness/unity.c.o build/tests/lab-test.c.o </w:t>
-      </w:r>
-      <w:r>
-        <w:rPr>
-          <w:rStyle w:val="AttributeTok"/>
-        </w:rPr>
-        <w:t xml:space="preserve">-o</w:t>
-      </w:r>
-      <w:r>
-        <w:rPr>
-          <w:rStyle w:val="NormalTok"/>
-        </w:rPr>
-        <w:t xml:space="preserve"> build/tests/myapp_t </w:t>
-      </w:r>
-      <w:r>
-        <w:rPr>
-          <w:rStyle w:val="AttributeTok"/>
-        </w:rPr>
-        <w:t xml:space="preserve">-fprofile-arcs</w:t>
-      </w:r>
-      <w:r>
-        <w:rPr>
-          <w:rStyle w:val="NormalTok"/>
-        </w:rPr>
-        <w:t xml:space="preserve"> </w:t>
-      </w:r>
-      <w:r>
-        <w:rPr>
-          <w:rStyle w:val="AttributeTok"/>
-        </w:rPr>
-        <w:t xml:space="preserve">-ftest-coverage</w:t>
-      </w:r>
-      <w:r>
-        <w:br/>
-      </w:r>
-      <w:r>
-        <w:rPr>
-          <w:rStyle w:val="VariableTok"/>
-        </w:rPr>
-        <w:t xml:space="preserve">make</w:t>
-      </w:r>
-      <w:r>
-        <w:rPr>
-          <w:rStyle w:val="OperatorTok"/>
-        </w:rPr>
-        <w:t xml:space="preserve">[</w:t>
-      </w:r>
-      <w:r>
-        <w:rPr>
-          <w:rStyle w:val="DecValTok"/>
-        </w:rPr>
-        <w:t xml:space="preserve">1</w:t>
-      </w:r>
-      <w:r>
-        <w:rPr>
-          <w:rStyle w:val="OperatorTok"/>
-        </w:rPr>
-        <w:t xml:space="preserve">]</w:t>
-      </w:r>
-      <w:r>
-        <w:rPr>
-          <w:rStyle w:val="ExtensionTok"/>
-        </w:rPr>
-        <w:t xml:space="preserve">:</w:t>
-      </w:r>
-      <w:r>
-        <w:rPr>
-          <w:rStyle w:val="NormalTok"/>
-        </w:rPr>
-        <w:t xml:space="preserve"> Leaving directory </w:t>
-      </w:r>
-      <w:r>
-        <w:rPr>
-          <w:rStyle w:val="StringTok"/>
-        </w:rPr>
-        <w:t xml:space="preserve">'/home/PERRYARYEE/Computer-Networks-CS525'</w:t>
-      </w:r>
-      <w:r>
-        <w:br/>
-      </w:r>
-      <w:r>
-        <w:rPr>
-          <w:rStyle w:val="VariableTok"/>
-        </w:rPr>
-        <w:t xml:space="preserve">make</w:t>
-      </w:r>
-      <w:r>
-        <w:rPr>
-          <w:rStyle w:val="OperatorTok"/>
-        </w:rPr>
-        <w:t xml:space="preserve">[</w:t>
-      </w:r>
-      <w:r>
-        <w:rPr>
-          <w:rStyle w:val="DecValTok"/>
-        </w:rPr>
-        <w:t xml:space="preserve">1</w:t>
-      </w:r>
-      <w:r>
-        <w:rPr>
-          <w:rStyle w:val="OperatorTok"/>
-        </w:rPr>
-        <w:t xml:space="preserve">]</w:t>
-      </w:r>
-      <w:r>
-        <w:rPr>
-          <w:rStyle w:val="ExtensionTok"/>
-        </w:rPr>
-        <w:t xml:space="preserve">:</w:t>
-      </w:r>
-      <w:r>
-        <w:rPr>
-          <w:rStyle w:val="NormalTok"/>
-        </w:rPr>
-        <w:t xml:space="preserve"> Entering directory </w:t>
-      </w:r>
-      <w:r>
-        <w:rPr>
-          <w:rStyle w:val="StringTok"/>
-        </w:rPr>
-        <w:t xml:space="preserve">'/home/PERRYARYEE/Computer-Networks-CS525'</w:t>
-      </w:r>
-      <w:r>
-        <w:br/>
-      </w:r>
-      <w:r>
-        <w:rPr>
-          <w:rStyle w:val="FunctionTok"/>
-        </w:rPr>
-        <w:t xml:space="preserve">mkdir</w:t>
-      </w:r>
-      <w:r>
-        <w:rPr>
-          <w:rStyle w:val="NormalTok"/>
-        </w:rPr>
-        <w:t xml:space="preserve"> </w:t>
-      </w:r>
-      <w:r>
-        <w:rPr>
-          <w:rStyle w:val="AttributeTok"/>
-        </w:rPr>
-        <w:t xml:space="preserve">-p</w:t>
-      </w:r>
-      <w:r>
-        <w:rPr>
-          <w:rStyle w:val="NormalTok"/>
-        </w:rPr>
-        <w:t xml:space="preserve"> build/debug-test</w:t>
-      </w:r>
-      <w:r>
-        <w:br/>
-      </w:r>
-      <w:r>
-        <w:rPr>
-          <w:rStyle w:val="FunctionTok"/>
-        </w:rPr>
-        <w:t xml:space="preserve">cc</w:t>
-      </w:r>
-      <w:r>
-        <w:rPr>
-          <w:rStyle w:val="NormalTok"/>
-        </w:rPr>
-        <w:t xml:space="preserve"> </w:t>
-      </w:r>
-      <w:r>
-        <w:rPr>
-          <w:rStyle w:val="AttributeTok"/>
-        </w:rPr>
-        <w:t xml:space="preserve">-g</w:t>
-      </w:r>
-      <w:r>
-        <w:rPr>
-          <w:rStyle w:val="NormalTok"/>
-        </w:rPr>
-        <w:t xml:space="preserve"> </w:t>
-      </w:r>
-      <w:r>
-        <w:rPr>
-          <w:rStyle w:val="AttributeTok"/>
-        </w:rPr>
-        <w:t xml:space="preserve">-O0</w:t>
-      </w:r>
-      <w:r>
-        <w:rPr>
-          <w:rStyle w:val="NormalTok"/>
-        </w:rPr>
-        <w:t xml:space="preserve"> </w:t>
-      </w:r>
-      <w:r>
-        <w:rPr>
-          <w:rStyle w:val="AttributeTok"/>
-        </w:rPr>
-        <w:t xml:space="preserve">-DDEBUG</w:t>
-      </w:r>
-      <w:r>
-        <w:rPr>
-          <w:rStyle w:val="NormalTok"/>
-        </w:rPr>
-        <w:t xml:space="preserve"> </w:t>
-      </w:r>
-      <w:r>
-        <w:rPr>
-          <w:rStyle w:val="AttributeTok"/>
-        </w:rPr>
-        <w:t xml:space="preserve">-DTEST</w:t>
-      </w:r>
-      <w:r>
-        <w:rPr>
-          <w:rStyle w:val="NormalTok"/>
-        </w:rPr>
-        <w:t xml:space="preserve"> </w:t>
-      </w:r>
-      <w:r>
-        <w:rPr>
-          <w:rStyle w:val="AttributeTok"/>
-        </w:rPr>
-        <w:t xml:space="preserve">-fno-omit-frame-pointer</w:t>
-      </w:r>
-      <w:r>
-        <w:rPr>
-          <w:rStyle w:val="NormalTok"/>
-        </w:rPr>
-        <w:t xml:space="preserve"> </w:t>
-      </w:r>
-      <w:r>
-        <w:rPr>
-          <w:rStyle w:val="AttributeTok"/>
-        </w:rPr>
-        <w:t xml:space="preserve">-fsanitize</w:t>
-      </w:r>
-      <w:r>
-        <w:rPr>
-          <w:rStyle w:val="OperatorTok"/>
-        </w:rPr>
-        <w:t xml:space="preserve">=</w:t>
-      </w:r>
-      <w:r>
-        <w:rPr>
-          <w:rStyle w:val="NormalTok"/>
-        </w:rPr>
-        <w:t xml:space="preserve">address </w:t>
-      </w:r>
-      <w:r>
-        <w:rPr>
-          <w:rStyle w:val="AttributeTok"/>
-        </w:rPr>
-        <w:t xml:space="preserve">-c</w:t>
-      </w:r>
-      <w:r>
-        <w:rPr>
-          <w:rStyle w:val="NormalTok"/>
-        </w:rPr>
-        <w:t xml:space="preserve"> src/main.c </w:t>
-      </w:r>
-      <w:r>
-        <w:rPr>
-          <w:rStyle w:val="AttributeTok"/>
-        </w:rPr>
-        <w:t xml:space="preserve">-o</w:t>
-      </w:r>
-      <w:r>
-        <w:rPr>
-          <w:rStyle w:val="NormalTok"/>
-        </w:rPr>
-        <w:t xml:space="preserve"> build/debug-test/main.c.o</w:t>
-      </w:r>
-      <w:r>
-        <w:br/>
-      </w:r>
-      <w:r>
-        <w:rPr>
-          <w:rStyle w:val="FunctionTok"/>
-        </w:rPr>
-        <w:t xml:space="preserve">mkdir</w:t>
-      </w:r>
-      <w:r>
-        <w:rPr>
-          <w:rStyle w:val="NormalTok"/>
-        </w:rPr>
-        <w:t xml:space="preserve"> </w:t>
-      </w:r>
-      <w:r>
-        <w:rPr>
-          <w:rStyle w:val="AttributeTok"/>
-        </w:rPr>
-        <w:t xml:space="preserve">-p</w:t>
-      </w:r>
-      <w:r>
-        <w:rPr>
-          <w:rStyle w:val="NormalTok"/>
-        </w:rPr>
-        <w:t xml:space="preserve"> build/debug-test</w:t>
-      </w:r>
-      <w:r>
-        <w:br/>
-      </w:r>
-      <w:r>
-        <w:rPr>
-          <w:rStyle w:val="FunctionTok"/>
-        </w:rPr>
-        <w:t xml:space="preserve">cc</w:t>
-      </w:r>
-      <w:r>
-        <w:rPr>
-          <w:rStyle w:val="NormalTok"/>
-        </w:rPr>
-        <w:t xml:space="preserve"> </w:t>
-      </w:r>
-      <w:r>
-        <w:rPr>
-          <w:rStyle w:val="AttributeTok"/>
-        </w:rPr>
-        <w:t xml:space="preserve">-g</w:t>
-      </w:r>
-      <w:r>
-        <w:rPr>
-          <w:rStyle w:val="NormalTok"/>
-        </w:rPr>
-        <w:t xml:space="preserve"> </w:t>
-      </w:r>
-      <w:r>
-        <w:rPr>
-          <w:rStyle w:val="AttributeTok"/>
-        </w:rPr>
-        <w:t xml:space="preserve">-O0</w:t>
-      </w:r>
-      <w:r>
-        <w:rPr>
-          <w:rStyle w:val="NormalTok"/>
-        </w:rPr>
-        <w:t xml:space="preserve"> </w:t>
-      </w:r>
-      <w:r>
-        <w:rPr>
-          <w:rStyle w:val="AttributeTok"/>
-        </w:rPr>
-        <w:t xml:space="preserve">-DDEBUG</w:t>
-      </w:r>
-      <w:r>
-        <w:rPr>
-          <w:rStyle w:val="NormalTok"/>
-        </w:rPr>
-        <w:t xml:space="preserve"> </w:t>
-      </w:r>
-      <w:r>
-        <w:rPr>
-          <w:rStyle w:val="AttributeTok"/>
-        </w:rPr>
-        <w:t xml:space="preserve">-DTEST</w:t>
-      </w:r>
-      <w:r>
-        <w:rPr>
-          <w:rStyle w:val="NormalTok"/>
-        </w:rPr>
-        <w:t xml:space="preserve"> </w:t>
-      </w:r>
-      <w:r>
-        <w:rPr>
-          <w:rStyle w:val="AttributeTok"/>
-        </w:rPr>
-        <w:t xml:space="preserve">-fno-omit-frame-pointer</w:t>
-      </w:r>
-      <w:r>
-        <w:rPr>
-          <w:rStyle w:val="NormalTok"/>
-        </w:rPr>
-        <w:t xml:space="preserve"> </w:t>
-      </w:r>
-      <w:r>
-        <w:rPr>
-          <w:rStyle w:val="AttributeTok"/>
-        </w:rPr>
-        <w:t xml:space="preserve">-fsanitize</w:t>
-      </w:r>
-      <w:r>
-        <w:rPr>
-          <w:rStyle w:val="OperatorTok"/>
-        </w:rPr>
-        <w:t xml:space="preserve">=</w:t>
-      </w:r>
-      <w:r>
-        <w:rPr>
-          <w:rStyle w:val="NormalTok"/>
-        </w:rPr>
-        <w:t xml:space="preserve">address </w:t>
-      </w:r>
-      <w:r>
-        <w:rPr>
-          <w:rStyle w:val="AttributeTok"/>
-        </w:rPr>
-        <w:t xml:space="preserve">-c</w:t>
-      </w:r>
-      <w:r>
-        <w:rPr>
-          <w:rStyle w:val="NormalTok"/>
-        </w:rPr>
-        <w:t xml:space="preserve"> src/lab.c </w:t>
-      </w:r>
-      <w:r>
-        <w:rPr>
-          <w:rStyle w:val="AttributeTok"/>
-        </w:rPr>
-        <w:t xml:space="preserve">-o</w:t>
-      </w:r>
-      <w:r>
-        <w:rPr>
-          <w:rStyle w:val="NormalTok"/>
-        </w:rPr>
-        <w:t xml:space="preserve"> build/debug-test/lab.c.o</w:t>
-      </w:r>
-      <w:r>
-        <w:br/>
-      </w:r>
-      <w:r>
-        <w:rPr>
-          <w:rStyle w:val="FunctionTok"/>
-        </w:rPr>
-        <w:t xml:space="preserve">mkdir</w:t>
-      </w:r>
-      <w:r>
-        <w:rPr>
-          <w:rStyle w:val="NormalTok"/>
-        </w:rPr>
-        <w:t xml:space="preserve"> </w:t>
-      </w:r>
-      <w:r>
-        <w:rPr>
-          <w:rStyle w:val="AttributeTok"/>
-        </w:rPr>
-        <w:t xml:space="preserve">-p</w:t>
-      </w:r>
-      <w:r>
-        <w:rPr>
-          <w:rStyle w:val="NormalTok"/>
-        </w:rPr>
-        <w:t xml:space="preserve"> build/debug-test/harness/</w:t>
-      </w:r>
-      <w:r>
-        <w:br/>
-      </w:r>
-      <w:r>
-        <w:rPr>
-          <w:rStyle w:val="FunctionTok"/>
-        </w:rPr>
-        <w:t xml:space="preserve">cc</w:t>
-      </w:r>
-      <w:r>
-        <w:rPr>
-          <w:rStyle w:val="NormalTok"/>
-        </w:rPr>
-        <w:t xml:space="preserve"> </w:t>
-      </w:r>
-      <w:r>
-        <w:rPr>
-          <w:rStyle w:val="AttributeTok"/>
-        </w:rPr>
-        <w:t xml:space="preserve">-g</w:t>
-      </w:r>
-      <w:r>
-        <w:rPr>
-          <w:rStyle w:val="NormalTok"/>
-        </w:rPr>
-        <w:t xml:space="preserve"> </w:t>
-      </w:r>
-      <w:r>
-        <w:rPr>
-          <w:rStyle w:val="AttributeTok"/>
-        </w:rPr>
-        <w:t xml:space="preserve">-O0</w:t>
-      </w:r>
-      <w:r>
-        <w:rPr>
-          <w:rStyle w:val="NormalTok"/>
-        </w:rPr>
-        <w:t xml:space="preserve"> </w:t>
-      </w:r>
-      <w:r>
-        <w:rPr>
-          <w:rStyle w:val="AttributeTok"/>
-        </w:rPr>
-        <w:t xml:space="preserve">-DDEBUG</w:t>
-      </w:r>
-      <w:r>
-        <w:rPr>
-          <w:rStyle w:val="NormalTok"/>
-        </w:rPr>
-        <w:t xml:space="preserve"> </w:t>
-      </w:r>
-      <w:r>
-        <w:rPr>
-          <w:rStyle w:val="AttributeTok"/>
-        </w:rPr>
-        <w:t xml:space="preserve">-DTEST</w:t>
-      </w:r>
-      <w:r>
-        <w:rPr>
-          <w:rStyle w:val="NormalTok"/>
-        </w:rPr>
-        <w:t xml:space="preserve"> </w:t>
-      </w:r>
-      <w:r>
-        <w:rPr>
-          <w:rStyle w:val="AttributeTok"/>
-        </w:rPr>
-        <w:t xml:space="preserve">-fno-omit-frame-pointer</w:t>
-      </w:r>
-      <w:r>
-        <w:rPr>
-          <w:rStyle w:val="NormalTok"/>
-        </w:rPr>
-        <w:t xml:space="preserve"> </w:t>
-      </w:r>
-      <w:r>
-        <w:rPr>
-          <w:rStyle w:val="AttributeTok"/>
-        </w:rPr>
-        <w:t xml:space="preserve">-fsanitize</w:t>
-      </w:r>
-      <w:r>
-        <w:rPr>
-          <w:rStyle w:val="OperatorTok"/>
-        </w:rPr>
-        <w:t xml:space="preserve">=</w:t>
-      </w:r>
-      <w:r>
-        <w:rPr>
-          <w:rStyle w:val="NormalTok"/>
-        </w:rPr>
-        <w:t xml:space="preserve">address </w:t>
-      </w:r>
-      <w:r>
-        <w:rPr>
-          <w:rStyle w:val="AttributeTok"/>
-        </w:rPr>
-        <w:t xml:space="preserve">-c</w:t>
-      </w:r>
-      <w:r>
-        <w:rPr>
-          <w:rStyle w:val="NormalTok"/>
-        </w:rPr>
-        <w:t xml:space="preserve"> tests/harness/unity.c </w:t>
-      </w:r>
-      <w:r>
-        <w:rPr>
-          <w:rStyle w:val="AttributeTok"/>
-        </w:rPr>
-        <w:t xml:space="preserve">-o</w:t>
-      </w:r>
-      <w:r>
-        <w:rPr>
-          <w:rStyle w:val="NormalTok"/>
-        </w:rPr>
-        <w:t xml:space="preserve"> build/debug-test/harness/unity.c.o</w:t>
-      </w:r>
-      <w:r>
-        <w:br/>
-      </w:r>
-      <w:r>
-        <w:rPr>
-          <w:rStyle w:val="FunctionTok"/>
-        </w:rPr>
-        <w:t xml:space="preserve">mkdir</w:t>
-      </w:r>
-      <w:r>
-        <w:rPr>
-          <w:rStyle w:val="NormalTok"/>
-        </w:rPr>
-        <w:t xml:space="preserve"> </w:t>
-      </w:r>
-      <w:r>
-        <w:rPr>
-          <w:rStyle w:val="AttributeTok"/>
-        </w:rPr>
-        <w:t xml:space="preserve">-p</w:t>
-      </w:r>
-      <w:r>
-        <w:rPr>
-          <w:rStyle w:val="NormalTok"/>
-        </w:rPr>
-        <w:t xml:space="preserve"> build/debug-test/</w:t>
-      </w:r>
-      <w:r>
-        <w:br/>
-      </w:r>
-      <w:r>
-        <w:rPr>
-          <w:rStyle w:val="FunctionTok"/>
-        </w:rPr>
-        <w:t xml:space="preserve">cc</w:t>
-      </w:r>
-      <w:r>
-        <w:rPr>
-          <w:rStyle w:val="NormalTok"/>
-        </w:rPr>
-        <w:t xml:space="preserve"> </w:t>
-      </w:r>
-      <w:r>
-        <w:rPr>
-          <w:rStyle w:val="AttributeTok"/>
-        </w:rPr>
-        <w:t xml:space="preserve">-g</w:t>
-      </w:r>
-      <w:r>
-        <w:rPr>
-          <w:rStyle w:val="NormalTok"/>
-        </w:rPr>
-        <w:t xml:space="preserve"> </w:t>
-      </w:r>
-      <w:r>
-        <w:rPr>
-          <w:rStyle w:val="AttributeTok"/>
-        </w:rPr>
-        <w:t xml:space="preserve">-O0</w:t>
-      </w:r>
-      <w:r>
-        <w:rPr>
-          <w:rStyle w:val="NormalTok"/>
-        </w:rPr>
-        <w:t xml:space="preserve"> </w:t>
-      </w:r>
-      <w:r>
-        <w:rPr>
-          <w:rStyle w:val="AttributeTok"/>
-        </w:rPr>
-        <w:t xml:space="preserve">-DDEBUG</w:t>
-      </w:r>
-      <w:r>
-        <w:rPr>
-          <w:rStyle w:val="NormalTok"/>
-        </w:rPr>
-        <w:t xml:space="preserve"> </w:t>
-      </w:r>
-      <w:r>
-        <w:rPr>
-          <w:rStyle w:val="AttributeTok"/>
-        </w:rPr>
-        <w:t xml:space="preserve">-DTEST</w:t>
-      </w:r>
-      <w:r>
-        <w:rPr>
-          <w:rStyle w:val="NormalTok"/>
-        </w:rPr>
-        <w:t xml:space="preserve"> </w:t>
-      </w:r>
-      <w:r>
-        <w:rPr>
-          <w:rStyle w:val="AttributeTok"/>
-        </w:rPr>
-        <w:t xml:space="preserve">-fno-omit-frame-pointer</w:t>
-      </w:r>
-      <w:r>
-        <w:rPr>
-          <w:rStyle w:val="NormalTok"/>
-        </w:rPr>
-        <w:t xml:space="preserve"> </w:t>
-      </w:r>
-      <w:r>
-        <w:rPr>
-          <w:rStyle w:val="AttributeTok"/>
-        </w:rPr>
-        <w:t xml:space="preserve">-fsanitize</w:t>
-      </w:r>
-      <w:r>
-        <w:rPr>
-          <w:rStyle w:val="OperatorTok"/>
-        </w:rPr>
-        <w:t xml:space="preserve">=</w:t>
-      </w:r>
-      <w:r>
-        <w:rPr>
-          <w:rStyle w:val="NormalTok"/>
-        </w:rPr>
-        <w:t xml:space="preserve">address </w:t>
-      </w:r>
-      <w:r>
-        <w:rPr>
-          <w:rStyle w:val="AttributeTok"/>
-        </w:rPr>
-        <w:t xml:space="preserve">-c</w:t>
-      </w:r>
-      <w:r>
-        <w:rPr>
-          <w:rStyle w:val="NormalTok"/>
-        </w:rPr>
-        <w:t xml:space="preserve"> tests/lab-test.c </w:t>
-      </w:r>
-      <w:r>
-        <w:rPr>
-          <w:rStyle w:val="AttributeTok"/>
-        </w:rPr>
-        <w:t xml:space="preserve">-o</w:t>
-      </w:r>
-      <w:r>
-        <w:rPr>
-          <w:rStyle w:val="NormalTok"/>
-        </w:rPr>
-        <w:t xml:space="preserve"> build/debug-test/lab-test.c.o</w:t>
-      </w:r>
-      <w:r>
-        <w:br/>
-      </w:r>
-      <w:r>
-        <w:rPr>
-          <w:rStyle w:val="FunctionTok"/>
-        </w:rPr>
-        <w:t xml:space="preserve">cc</w:t>
-      </w:r>
-      <w:r>
-        <w:rPr>
-          <w:rStyle w:val="NormalTok"/>
-        </w:rPr>
-        <w:t xml:space="preserve"> </w:t>
-      </w:r>
-      <w:r>
-        <w:rPr>
-          <w:rStyle w:val="AttributeTok"/>
-        </w:rPr>
-        <w:t xml:space="preserve">-g</w:t>
-      </w:r>
-      <w:r>
-        <w:rPr>
-          <w:rStyle w:val="NormalTok"/>
-        </w:rPr>
-        <w:t xml:space="preserve"> </w:t>
-      </w:r>
-      <w:r>
-        <w:rPr>
-          <w:rStyle w:val="AttributeTok"/>
-        </w:rPr>
-        <w:t xml:space="preserve">-O0</w:t>
-      </w:r>
-      <w:r>
-        <w:rPr>
-          <w:rStyle w:val="NormalTok"/>
-        </w:rPr>
-        <w:t xml:space="preserve"> </w:t>
-      </w:r>
-      <w:r>
-        <w:rPr>
-          <w:rStyle w:val="AttributeTok"/>
-        </w:rPr>
-        <w:t xml:space="preserve">-DDEBUG</w:t>
-      </w:r>
-      <w:r>
-        <w:rPr>
-          <w:rStyle w:val="NormalTok"/>
-        </w:rPr>
-        <w:t xml:space="preserve"> </w:t>
-      </w:r>
-      <w:r>
-        <w:rPr>
-          <w:rStyle w:val="AttributeTok"/>
-        </w:rPr>
-        <w:t xml:space="preserve">-DTEST</w:t>
-      </w:r>
-      <w:r>
-        <w:rPr>
-          <w:rStyle w:val="NormalTok"/>
-        </w:rPr>
-        <w:t xml:space="preserve"> </w:t>
-      </w:r>
-      <w:r>
-        <w:rPr>
-          <w:rStyle w:val="AttributeTok"/>
-        </w:rPr>
-        <w:t xml:space="preserve">-fno-omit-frame-pointer</w:t>
-      </w:r>
-      <w:r>
-        <w:rPr>
-          <w:rStyle w:val="NormalTok"/>
-        </w:rPr>
-        <w:t xml:space="preserve"> </w:t>
-      </w:r>
-      <w:r>
-        <w:rPr>
-          <w:rStyle w:val="AttributeTok"/>
-        </w:rPr>
-        <w:t xml:space="preserve">-fsanitize</w:t>
-      </w:r>
-      <w:r>
-        <w:rPr>
-          <w:rStyle w:val="OperatorTok"/>
-        </w:rPr>
-        <w:t xml:space="preserve">=</w:t>
-      </w:r>
-      <w:r>
-        <w:rPr>
-          <w:rStyle w:val="NormalTok"/>
-        </w:rPr>
-        <w:t xml:space="preserve">address build/debug-test/main.c.o build/debug-test/lab.c.o build/debug-test/harness/unity.c.o build/debug-test/lab-test.c.o </w:t>
+        <w:t xml:space="preserve">address build/debug-test/lab.c.o build/debug-test/main.c.o build/debug-test/harness/unity.c.o build/debug-test/lab-test.c.o </w:t>
       </w:r>
       <w:r>
         <w:rPr>
@@ -5767,7 +5767,16 @@
         <w:rPr>
           <w:rStyle w:val="CommentTok"/>
         </w:rPr>
-        <w:t xml:space="preserve">/** * </w:t>
+        <w:t xml:space="preserve">/** </w:t>
+      </w:r>
+      <w:r>
+        <w:br/>
+      </w:r>
+      <w:r>
+        <w:rPr>
+          <w:rStyle w:val="CommentTok"/>
+        </w:rPr>
+        <w:t xml:space="preserve"> * </w:t>
       </w:r>
       <w:r>
         <w:rPr>
@@ -6508,79 +6517,16 @@
         <w:rPr>
           <w:rStyle w:val="CommentTok"/>
         </w:rPr>
-        <w:t xml:space="preserve">/**</w:t>
-      </w:r>
-      <w:r>
-        <w:br/>
-      </w:r>
-      <w:r>
-        <w:rPr>
-          <w:rStyle w:val="CommentTok"/>
-        </w:rPr>
-        <w:t xml:space="preserve"> * </w:t>
-      </w:r>
-      <w:r>
-        <w:rPr>
-          <w:rStyle w:val="AnnotationTok"/>
-        </w:rPr>
-        <w:t xml:space="preserve">@brief</w:t>
-      </w:r>
-      <w:r>
-        <w:rPr>
-          <w:rStyle w:val="CommentTok"/>
-        </w:rPr>
-        <w:t xml:space="preserve"> Documents AI assistance used during Task 4.</w:t>
-      </w:r>
-      <w:r>
-        <w:br/>
-      </w:r>
-      <w:r>
-        <w:rPr>
-          <w:rStyle w:val="CommentTok"/>
-        </w:rPr>
-        <w:t xml:space="preserve"> *</w:t>
-      </w:r>
-      <w:r>
-        <w:br/>
-      </w:r>
-      <w:r>
-        <w:rPr>
-          <w:rStyle w:val="CommentTok"/>
-        </w:rPr>
-        <w:t xml:space="preserve"> * </w:t>
-      </w:r>
-      <w:r>
-        <w:rPr>
-          <w:rStyle w:val="InformationTok"/>
-        </w:rPr>
-        <w:t xml:space="preserve">@note</w:t>
-      </w:r>
-      <w:r>
-        <w:rPr>
-          <w:rStyle w:val="CommentTok"/>
-        </w:rPr>
-        <w:t xml:space="preserve"> AI usage: ChatGPT assisted with understanding the memory leaks required by Task 4.</w:t>
-      </w:r>
-      <w:r>
-        <w:br/>
-      </w:r>
-      <w:r>
-        <w:rPr>
-          <w:rStyle w:val="CommentTok"/>
-        </w:rPr>
-        <w:t xml:space="preserve"> * </w:t>
-      </w:r>
-      <w:r>
-        <w:br/>
-      </w:r>
-      <w:r>
-        <w:rPr>
-          <w:rStyle w:val="CommentTok"/>
-        </w:rPr>
-        <w:t xml:space="preserve"> */</w:t>
-      </w:r>
-      <w:r>
-        <w:br/>
+        <w:t xml:space="preserve">// ChatGPT assisted with understanding the memory leaks required by Task 4.</w:t>
+      </w:r>
+      <w:r>
+        <w:br/>
+      </w:r>
+      <w:r>
+        <w:rPr>
+          <w:rStyle w:val="NormalTok"/>
+        </w:rPr>
+        <w:t xml:space="preserve"> </w:t>
       </w:r>
       <w:r>
         <w:br/>
@@ -8259,7 +8205,7 @@
         <w:pStyle w:val="FirstParagraph"/>
       </w:pPr>
       <w:r>
-        <w:t xml:space="preserve">Report generated on 08/31/2026 at 09:41:14</w:t>
+        <w:t xml:space="preserve">Report generated on 08/31/2026 at 09:59:22</w:t>
       </w:r>
     </w:p>
     <w:p>
@@ -8284,7 +8230,7 @@
         <w:pStyle w:val="FirstParagraph"/>
       </w:pPr>
       <w:r>
-        <w:t xml:space="preserve">SHA-256 Hash of the report: add3adfcc739942e07f5f9031ec784055feabc65d581fc2cdd322ed5fca70514</w:t>
+        <w:t xml:space="preserve">SHA-256 Hash of the report: 6665854597c2ff4084c9f48258a3064df27411ebe1658ff461596b2ae7033e33</w:t>
       </w:r>
     </w:p>
     <w:p>

</xml_diff>